<commit_message>
docs: add BRIEFINGS.md — living "along the way" + "once I get there" briefings
Captures the core unmet need: two briefings on one continuously-updating
timeline. The passage briefing (spacetime weather) and the destination
dossier (arrival weather + formalities + services + anchorage + community
reports + climate). Honest source map: open (OSM/OpenSeaMap) + owned
(Helm pins/reviews) + cited RAG over Noonsite/blogs/forums; NoForeignLand
push-only/partnership, SeaPeople not integrable (serve the need from
allowed sources instead). Two-axis timeline (valid-time + issue-time),
diff-not-dump updates, and the LLM/RAG guardrails: never invent, cite +
date + link, respect the walls, owned > scraped, offline-aware.

Rebuilds Helm-Strategy-Brief.docx with all four strategy docs.

Co-Authored-By: Claude Opus 4.8 <noreply@anthropic.com>
Claude-Session: https://claude.ai/code/session_01QiBTQdjn7k7KJRRdUortXu
</commit_message>
<xml_diff>
--- a/Helm-Strategy-Brief.docx
+++ b/Helm-Strategy-Brief.docx
@@ -8006,6 +8006,2316 @@
     <w:p>
       <w:r>
         <w:t>data; and the routing is easy where it can be and honest where it can't.*</w:t>
+      </w:r>
+    </w:p>
+    <w:p>
+      <w:r>
+        <w:br w:type="page"/>
+      </w:r>
+    </w:p>
+    <w:p>
+      <w:pPr>
+        <w:pStyle w:val="Heading1"/>
+      </w:pPr>
+      <w:r/>
+      <w:r>
+        <w:t>Helm — Living Briefings: "Along the Way" &amp; "Once I Get There"</w:t>
+      </w:r>
+    </w:p>
+    <w:p>
+      <w:r>
+        <w:t>**Two briefings, both living. One tells you what to expect *en route*; one tells you what</w:t>
+      </w:r>
+    </w:p>
+    <w:p>
+      <w:r>
+        <w:t>to expect *at the destination*. Neither is a one-shot report — they ingest continuously and</w:t>
+      </w:r>
+    </w:p>
+    <w:p>
+      <w:r>
+        <w:t>update on a timeline as the picture changes.**</w:t>
+      </w:r>
+    </w:p>
+    <w:p>
+      <w:pPr>
+        <w:ind w:left="432"/>
+        <w:pBdr>
+          <w:left w:val="single" w:sz="18" w:space="8" w:color="5BC0FF"/>
+        </w:pBdr>
+      </w:pPr>
+      <w:r>
+        <w:rPr>
+          <w:i/>
+          <w:color w:val="5A6B78"/>
+        </w:rPr>
+        <w:t xml:space="preserve">Status: Spec draft v0.1 · 2026-06-24 · Owner: Steve Ridder The single most-requested capability, in Steve's words: *"Briefings — what to expect along the way, and what to expect once I get there — are my unmet need."* Companion to </w:t>
+      </w:r>
+      <w:r>
+        <w:rPr>
+          <w:i/>
+          <w:color w:val="5A6B78"/>
+          <w:u w:val="single"/>
+        </w:rPr>
+        <w:t>WEATHER-ROUTING.md</w:t>
+      </w:r>
+      <w:r>
+        <w:rPr>
+          <w:i/>
+          <w:color w:val="5A6B78"/>
+        </w:rPr>
+        <w:t xml:space="preserve"> (the spacetime weather engine), </w:t>
+      </w:r>
+      <w:r>
+        <w:rPr>
+          <w:i/>
+          <w:color w:val="5A6B78"/>
+          <w:u w:val="single"/>
+        </w:rPr>
+        <w:t>VISION.md</w:t>
+      </w:r>
+      <w:r>
+        <w:rPr>
+          <w:i/>
+          <w:color w:val="5A6B78"/>
+        </w:rPr>
+        <w:t xml:space="preserve"> §8 (the copilot), and </w:t>
+      </w:r>
+      <w:r>
+        <w:rPr>
+          <w:i/>
+          <w:color w:val="5A6B78"/>
+          <w:u w:val="single"/>
+        </w:rPr>
+        <w:t>integrations/noforeignland.md</w:t>
+      </w:r>
+      <w:r>
+        <w:rPr>
+          <w:i/>
+          <w:color w:val="5A6B78"/>
+        </w:rPr>
+        <w:t xml:space="preserve"> (the community-data walls).  </w:t>
+      </w:r>
+      <w:r>
+        <w:rPr>
+          <w:b/>
+          <w:i/>
+          <w:color w:val="5A6B78"/>
+        </w:rPr>
+        <w:t>Honesty note:</w:t>
+      </w:r>
+      <w:r>
+        <w:rPr>
+          <w:i/>
+          <w:color w:val="5A6B78"/>
+        </w:rPr>
+        <w:t xml:space="preserve"> briefings are </w:t>
+      </w:r>
+      <w:r>
+        <w:rPr>
+          <w:b/>
+          <w:i/>
+          <w:color w:val="5A6B78"/>
+        </w:rPr>
+        <w:t>LLM-derived synthesis</w:t>
+      </w:r>
+      <w:r>
+        <w:rPr>
+          <w:i/>
+          <w:color w:val="5A6B78"/>
+        </w:rPr>
+        <w:t xml:space="preserve"> over data Helm fetches. The LLM *summarizes, sequences, and narrates* — it never invents a forecast, a fee, a depth, or a review. Every claim is sourced, dated, and links back. Guardrails in §6.</w:t>
+      </w:r>
+    </w:p>
+    <w:p>
+      <w:pPr>
+        <w:spacing w:before="40" w:after="40"/>
+        <w:pBdr>
+          <w:bottom w:val="single" w:sz="6" w:space="1" w:color="C8D2DA"/>
+        </w:pBdr>
+      </w:pPr>
+    </w:p>
+    <w:p>
+      <w:pPr>
+        <w:pStyle w:val="Heading2"/>
+      </w:pPr>
+      <w:r/>
+      <w:r>
+        <w:t>1. The two briefings</w:t>
+      </w:r>
+    </w:p>
+    <w:tbl>
+      <w:tblPr>
+        <w:tblStyle w:val="TableGrid"/>
+        <w:tblW w:type="auto" w:w="0"/>
+        <w:jc w:val="center"/>
+        <w:tblLook w:firstColumn="1" w:firstRow="1" w:lastColumn="0" w:lastRow="0" w:noHBand="0" w:noVBand="1" w:val="04A0"/>
+      </w:tblPr>
+      <w:tblGrid>
+        <w:gridCol w:w="2880"/>
+        <w:gridCol w:w="2880"/>
+        <w:gridCol w:w="2880"/>
+      </w:tblGrid>
+      <w:tr>
+        <w:tc>
+          <w:tcPr>
+            <w:tcW w:type="dxa" w:w="2880"/>
+            <w:shd w:val="clear" w:fill="1F6FA8"/>
+          </w:tcPr>
+          <w:p>
+            <w:r>
+              <w:rPr>
+                <w:b/>
+                <w:color w:val="FFFFFF"/>
+                <w:sz w:val="19"/>
+              </w:rPr>
+            </w:r>
+          </w:p>
+        </w:tc>
+        <w:tc>
+          <w:tcPr>
+            <w:tcW w:type="dxa" w:w="2880"/>
+            <w:shd w:val="clear" w:fill="1F6FA8"/>
+          </w:tcPr>
+          <w:p>
+            <w:r>
+              <w:rPr>
+                <w:b/>
+                <w:color w:val="FFFFFF"/>
+                <w:sz w:val="19"/>
+              </w:rPr>
+            </w:r>
+            <w:r>
+              <w:rPr>
+                <w:b/>
+                <w:color w:val="FFFFFF"/>
+                <w:sz w:val="19"/>
+              </w:rPr>
+              <w:t>Along the Way</w:t>
+            </w:r>
+          </w:p>
+        </w:tc>
+        <w:tc>
+          <w:tcPr>
+            <w:tcW w:type="dxa" w:w="2880"/>
+            <w:shd w:val="clear" w:fill="1F6FA8"/>
+          </w:tcPr>
+          <w:p>
+            <w:r>
+              <w:rPr>
+                <w:b/>
+                <w:color w:val="FFFFFF"/>
+                <w:sz w:val="19"/>
+              </w:rPr>
+            </w:r>
+            <w:r>
+              <w:rPr>
+                <w:b/>
+                <w:color w:val="FFFFFF"/>
+                <w:sz w:val="19"/>
+              </w:rPr>
+              <w:t>Once I Get There</w:t>
+            </w:r>
+          </w:p>
+        </w:tc>
+      </w:tr>
+      <w:tr>
+        <w:tc>
+          <w:tcPr>
+            <w:tcW w:type="dxa" w:w="2880"/>
+          </w:tcPr>
+          <w:p>
+            <w:r>
+              <w:rPr>
+                <w:sz w:val="18"/>
+              </w:rPr>
+            </w:r>
+            <w:r>
+              <w:rPr>
+                <w:sz w:val="18"/>
+              </w:rPr>
+              <w:t>Question it answers</w:t>
+            </w:r>
+          </w:p>
+        </w:tc>
+        <w:tc>
+          <w:tcPr>
+            <w:tcW w:type="dxa" w:w="2880"/>
+          </w:tcPr>
+          <w:p>
+            <w:r>
+              <w:rPr>
+                <w:sz w:val="18"/>
+              </w:rPr>
+            </w:r>
+            <w:r>
+              <w:rPr>
+                <w:sz w:val="18"/>
+              </w:rPr>
+              <w:t>"What will the passage be like?"</w:t>
+            </w:r>
+          </w:p>
+        </w:tc>
+        <w:tc>
+          <w:tcPr>
+            <w:tcW w:type="dxa" w:w="2880"/>
+          </w:tcPr>
+          <w:p>
+            <w:r>
+              <w:rPr>
+                <w:sz w:val="18"/>
+              </w:rPr>
+            </w:r>
+            <w:r>
+              <w:rPr>
+                <w:sz w:val="18"/>
+              </w:rPr>
+              <w:t>"What's it like when I arrive?"</w:t>
+            </w:r>
+          </w:p>
+        </w:tc>
+      </w:tr>
+      <w:tr>
+        <w:tc>
+          <w:tcPr>
+            <w:tcW w:type="dxa" w:w="2880"/>
+          </w:tcPr>
+          <w:p>
+            <w:r>
+              <w:rPr>
+                <w:sz w:val="18"/>
+              </w:rPr>
+            </w:r>
+            <w:r>
+              <w:rPr>
+                <w:sz w:val="18"/>
+              </w:rPr>
+              <w:t>Primary data</w:t>
+            </w:r>
+          </w:p>
+        </w:tc>
+        <w:tc>
+          <w:tcPr>
+            <w:tcW w:type="dxa" w:w="2880"/>
+          </w:tcPr>
+          <w:p>
+            <w:r>
+              <w:rPr>
+                <w:sz w:val="18"/>
+              </w:rPr>
+            </w:r>
+            <w:r>
+              <w:rPr>
+                <w:sz w:val="18"/>
+              </w:rPr>
+              <w:t>weather + sea-state at the boat's projected position; tropical/climate; hazards</w:t>
+            </w:r>
+          </w:p>
+        </w:tc>
+        <w:tc>
+          <w:tcPr>
+            <w:tcW w:type="dxa" w:w="2880"/>
+          </w:tcPr>
+          <w:p>
+            <w:r>
+              <w:rPr>
+                <w:sz w:val="18"/>
+              </w:rPr>
+            </w:r>
+            <w:r>
+              <w:rPr>
+                <w:sz w:val="18"/>
+              </w:rPr>
+              <w:t>services, formalities, anchorage quality, community reports, climate, arrival weather</w:t>
+            </w:r>
+          </w:p>
+        </w:tc>
+      </w:tr>
+      <w:tr>
+        <w:tc>
+          <w:tcPr>
+            <w:tcW w:type="dxa" w:w="2880"/>
+          </w:tcPr>
+          <w:p>
+            <w:r>
+              <w:rPr>
+                <w:sz w:val="18"/>
+              </w:rPr>
+            </w:r>
+            <w:r>
+              <w:rPr>
+                <w:sz w:val="18"/>
+              </w:rPr>
+              <w:t>Engine</w:t>
+            </w:r>
+          </w:p>
+        </w:tc>
+        <w:tc>
+          <w:tcPr>
+            <w:tcW w:type="dxa" w:w="2880"/>
+          </w:tcPr>
+          <w:p>
+            <w:r>
+              <w:rPr>
+                <w:sz w:val="18"/>
+              </w:rPr>
+            </w:r>
+            <w:r>
+              <w:rPr>
+                <w:sz w:val="18"/>
+              </w:rPr>
+              <w:t xml:space="preserve">the spacetime weather model </w:t>
+            </w:r>
+            <w:r>
+              <w:rPr>
+                <w:rFonts w:ascii="Consolas" w:hAnsi="Consolas"/>
+                <w:color w:val="9B2C5E"/>
+                <w:sz w:val="18"/>
+              </w:rPr>
+              <w:t>W(P(t), t)</w:t>
+            </w:r>
+            <w:r>
+              <w:rPr>
+                <w:sz w:val="18"/>
+              </w:rPr>
+              <w:t xml:space="preserve"> (</w:t>
+            </w:r>
+            <w:r>
+              <w:rPr>
+                <w:color w:val="1F6FA8"/>
+                <w:sz w:val="18"/>
+                <w:u w:val="single"/>
+              </w:rPr>
+              <w:t>WEATHER-ROUTING.md</w:t>
+            </w:r>
+            <w:r>
+              <w:rPr>
+                <w:sz w:val="18"/>
+              </w:rPr>
+              <w:t>)</w:t>
+            </w:r>
+          </w:p>
+        </w:tc>
+        <w:tc>
+          <w:tcPr>
+            <w:tcW w:type="dxa" w:w="2880"/>
+          </w:tcPr>
+          <w:p>
+            <w:r>
+              <w:rPr>
+                <w:sz w:val="18"/>
+              </w:rPr>
+            </w:r>
+            <w:r>
+              <w:rPr>
+                <w:sz w:val="18"/>
+              </w:rPr>
+              <w:t>destination data fusion + RAG over community/blogs/guides</w:t>
+            </w:r>
+          </w:p>
+        </w:tc>
+      </w:tr>
+      <w:tr>
+        <w:tc>
+          <w:tcPr>
+            <w:tcW w:type="dxa" w:w="2880"/>
+          </w:tcPr>
+          <w:p>
+            <w:r>
+              <w:rPr>
+                <w:sz w:val="18"/>
+              </w:rPr>
+            </w:r>
+            <w:r>
+              <w:rPr>
+                <w:sz w:val="18"/>
+              </w:rPr>
+              <w:t>Cadence</w:t>
+            </w:r>
+          </w:p>
+        </w:tc>
+        <w:tc>
+          <w:tcPr>
+            <w:tcW w:type="dxa" w:w="2880"/>
+          </w:tcPr>
+          <w:p>
+            <w:r>
+              <w:rPr>
+                <w:sz w:val="18"/>
+              </w:rPr>
+            </w:r>
+            <w:r>
+              <w:rPr>
+                <w:sz w:val="18"/>
+              </w:rPr>
+              <w:t>continuous — re-runs on every new GRIB</w:t>
+            </w:r>
+          </w:p>
+        </w:tc>
+        <w:tc>
+          <w:tcPr>
+            <w:tcW w:type="dxa" w:w="2880"/>
+          </w:tcPr>
+          <w:p>
+            <w:r>
+              <w:rPr>
+                <w:sz w:val="18"/>
+              </w:rPr>
+            </w:r>
+            <w:r>
+              <w:rPr>
+                <w:sz w:val="18"/>
+              </w:rPr>
+              <w:t>continuous — refreshes as you approach + as community/weather data changes</w:t>
+            </w:r>
+          </w:p>
+        </w:tc>
+      </w:tr>
+      <w:tr>
+        <w:tc>
+          <w:tcPr>
+            <w:tcW w:type="dxa" w:w="2880"/>
+          </w:tcPr>
+          <w:p>
+            <w:r>
+              <w:rPr>
+                <w:sz w:val="18"/>
+              </w:rPr>
+            </w:r>
+            <w:r>
+              <w:rPr>
+                <w:sz w:val="18"/>
+              </w:rPr>
+              <w:t>View</w:t>
+            </w:r>
+          </w:p>
+        </w:tc>
+        <w:tc>
+          <w:tcPr>
+            <w:tcW w:type="dxa" w:w="2880"/>
+          </w:tcPr>
+          <w:p>
+            <w:r>
+              <w:rPr>
+                <w:sz w:val="18"/>
+              </w:rPr>
+            </w:r>
+            <w:r>
+              <w:rPr>
+                <w:sz w:val="18"/>
+              </w:rPr>
+              <w:t xml:space="preserve">the route-weather </w:t>
+            </w:r>
+            <w:r>
+              <w:rPr>
+                <w:b/>
+                <w:sz w:val="18"/>
+              </w:rPr>
+              <w:t>timeline</w:t>
+            </w:r>
+          </w:p>
+        </w:tc>
+        <w:tc>
+          <w:tcPr>
+            <w:tcW w:type="dxa" w:w="2880"/>
+          </w:tcPr>
+          <w:p>
+            <w:r>
+              <w:rPr>
+                <w:sz w:val="18"/>
+              </w:rPr>
+            </w:r>
+            <w:r>
+              <w:rPr>
+                <w:sz w:val="18"/>
+              </w:rPr>
+              <w:t xml:space="preserve">the destination </w:t>
+            </w:r>
+            <w:r>
+              <w:rPr>
+                <w:b/>
+                <w:sz w:val="18"/>
+              </w:rPr>
+              <w:t>dossier</w:t>
+            </w:r>
+            <w:r>
+              <w:rPr>
+                <w:sz w:val="18"/>
+              </w:rPr>
+              <w:t>, on the same timeline</w:t>
+            </w:r>
+          </w:p>
+        </w:tc>
+      </w:tr>
+    </w:tbl>
+    <w:p/>
+    <w:p>
+      <w:r>
+        <w:t xml:space="preserve">They share </w:t>
+      </w:r>
+      <w:r>
+        <w:rPr>
+          <w:b/>
+        </w:rPr>
+        <w:t>one timeline</w:t>
+      </w:r>
+      <w:r>
+        <w:t>. Scrub it and *both* update: the en-route weather and the</w:t>
+      </w:r>
+    </w:p>
+    <w:p>
+      <w:r>
+        <w:t>arrival picture move together, because "what it's like there" depends on *when* you get</w:t>
+      </w:r>
+    </w:p>
+    <w:p>
+      <w:r>
+        <w:t>there.</w:t>
+      </w:r>
+    </w:p>
+    <w:p>
+      <w:pPr>
+        <w:spacing w:before="40" w:after="40"/>
+        <w:pBdr>
+          <w:bottom w:val="single" w:sz="6" w:space="1" w:color="C8D2DA"/>
+        </w:pBdr>
+      </w:pPr>
+    </w:p>
+    <w:p>
+      <w:pPr>
+        <w:pStyle w:val="Heading2"/>
+      </w:pPr>
+      <w:r/>
+      <w:r>
+        <w:t>2. "Along the Way" — the passage briefing</w:t>
+      </w:r>
+    </w:p>
+    <w:p>
+      <w:r>
+        <w:t xml:space="preserve">Already specified in </w:t>
+      </w:r>
+      <w:r>
+        <w:rPr>
+          <w:color w:val="1F6FA8"/>
+          <w:u w:val="single"/>
+        </w:rPr>
+        <w:t>WEATHER-ROUTING.md</w:t>
+      </w:r>
+      <w:r>
+        <w:t>; summarized here as one half of</w:t>
+      </w:r>
+    </w:p>
+    <w:p>
+      <w:r>
+        <w:t xml:space="preserve">the pair. </w:t>
+      </w:r>
+      <w:r>
+        <w:rPr>
+          <w:b/>
+        </w:rPr>
+        <w:t>[LLM]</w:t>
+      </w:r>
+      <w:r>
+        <w:t xml:space="preserve"> narration over a </w:t>
+      </w:r>
+      <w:r>
+        <w:rPr>
+          <w:b/>
+        </w:rPr>
+        <w:t>deterministic</w:t>
+      </w:r>
+      <w:r>
+        <w:t xml:space="preserve"> core:</w:t>
+      </w:r>
+    </w:p>
+    <w:p>
+      <w:pPr>
+        <w:ind w:left="432"/>
+        <w:pBdr>
+          <w:left w:val="single" w:sz="18" w:space="8" w:color="5BC0FF"/>
+        </w:pBdr>
+      </w:pPr>
+      <w:r>
+        <w:rPr>
+          <w:i/>
+          <w:color w:val="5A6B78"/>
+        </w:rPr>
+        <w:t>*"You'll motor out of the lagoon into light SE, build to 18–22 kt by Tuesday night, then a front Thursday afternoon brings 30 kt on the nose for ~12 h before it eases. Seas peak ~3 m @ 11 s. No tropical activity on the route through Friday; the Sunday picture is climatology only — low confidence, recheck en route."*</w:t>
+      </w:r>
+    </w:p>
+    <w:p>
+      <w:r>
+        <w:t>Built from: wind / gust / swell / sea-state sampled along the worldline, the tropical-cyclone</w:t>
+      </w:r>
+    </w:p>
+    <w:p>
+      <w:r>
+        <w:t>layer, and the climatology tier for the part of the passage beyond forecast skill. Confidence</w:t>
+      </w:r>
+    </w:p>
+    <w:p>
+      <w:r>
+        <w:t xml:space="preserve">and horizon are always shown. </w:t>
+      </w:r>
+      <w:r>
+        <w:rPr>
+          <w:b/>
+        </w:rPr>
+        <w:t>[honesty]</w:t>
+      </w:r>
+    </w:p>
+    <w:p>
+      <w:pPr>
+        <w:spacing w:before="40" w:after="40"/>
+        <w:pBdr>
+          <w:bottom w:val="single" w:sz="6" w:space="1" w:color="C8D2DA"/>
+        </w:pBdr>
+      </w:pPr>
+    </w:p>
+    <w:p>
+      <w:pPr>
+        <w:pStyle w:val="Heading2"/>
+      </w:pPr>
+      <w:r/>
+      <w:r>
+        <w:t>3. "Once I Get There" — the destination dossier</w:t>
+      </w:r>
+    </w:p>
+    <w:p>
+      <w:r>
+        <w:t>This is the genuinely new surface. When you set a destination (or click a waypoint/port),</w:t>
+      </w:r>
+    </w:p>
+    <w:p>
+      <w:r>
+        <w:t xml:space="preserve">Helm assembles a </w:t>
+      </w:r>
+      <w:r>
+        <w:rPr>
+          <w:b/>
+        </w:rPr>
+        <w:t>living dossier</w:t>
+      </w:r>
+      <w:r>
+        <w:t xml:space="preserve"> of what to expect on arrival:</w:t>
+      </w:r>
+    </w:p>
+    <w:p>
+      <w:pPr>
+        <w:pStyle w:val="ListBullet"/>
+      </w:pPr>
+      <w:r>
+        <w:rPr>
+          <w:b/>
+        </w:rPr>
+        <w:t>Arrival weather &amp; sea-state</w:t>
+      </w:r>
+      <w:r>
+        <w:t xml:space="preserve"> — the forecast valid at *your ETA*, plus the approach</w:t>
+      </w:r>
+    </w:p>
+    <w:p>
+      <w:r>
+        <w:t>conditions (swell into the pass, wind over the anchorage, tide/current at the entrance).</w:t>
+      </w:r>
+    </w:p>
+    <w:p>
+      <w:pPr>
+        <w:pStyle w:val="ListBullet"/>
+      </w:pPr>
+      <w:r>
+        <w:rPr>
+          <w:b/>
+        </w:rPr>
+        <w:t>Formalities &amp; check-in</w:t>
+      </w:r>
+      <w:r>
+        <w:t xml:space="preserve"> — customs/immigration, fees, flag/quarantine, hours, ports of</w:t>
+      </w:r>
+    </w:p>
+    <w:p>
+      <w:r>
+        <w:t xml:space="preserve">entry. *(This is the </w:t>
+      </w:r>
+      <w:r>
+        <w:rPr>
+          <w:color w:val="1F6FA8"/>
+          <w:u w:val="single"/>
+        </w:rPr>
+        <w:t>Noonsite</w:t>
+      </w:r>
+      <w:r>
+        <w:t>-shaped need — the #1 thing</w:t>
+      </w:r>
+    </w:p>
+    <w:p>
+      <w:r>
+        <w:t>cruisers research before a new country.)*</w:t>
+      </w:r>
+    </w:p>
+    <w:p>
+      <w:pPr>
+        <w:pStyle w:val="ListBullet"/>
+      </w:pPr>
+      <w:r>
+        <w:rPr>
+          <w:b/>
+        </w:rPr>
+        <w:t>Anchorage / marina intelligence</w:t>
+      </w:r>
+      <w:r>
+        <w:t xml:space="preserve"> — holding, shelter by wind direction, depth, room,</w:t>
+      </w:r>
+    </w:p>
+    <w:p>
+      <w:r>
+        <w:t>hazards, mooring availability, "exposed to SW swell."</w:t>
+      </w:r>
+    </w:p>
+    <w:p>
+      <w:pPr>
+        <w:pStyle w:val="ListBullet"/>
+      </w:pPr>
+      <w:r>
+        <w:rPr>
+          <w:b/>
+        </w:rPr>
+        <w:t>Services &amp; provisioning</w:t>
+      </w:r>
+      <w:r>
+        <w:t xml:space="preserve"> — fuel, water, repairs, chandlery, haul-out, groceries,</w:t>
+      </w:r>
+    </w:p>
+    <w:p>
+      <w:r>
+        <w:t>laundry, medical, fresh produce, SIM/data.</w:t>
+      </w:r>
+    </w:p>
+    <w:p>
+      <w:pPr>
+        <w:pStyle w:val="ListBullet"/>
+      </w:pPr>
+      <w:r>
+        <w:rPr>
+          <w:b/>
+        </w:rPr>
+        <w:t>Community reports &amp; sentiment</w:t>
+      </w:r>
+      <w:r>
+        <w:t xml:space="preserve"> — recent cruiser experiences: what's current, what</w:t>
+      </w:r>
+    </w:p>
+    <w:p>
+      <w:r>
+        <w:t>changed, what to watch. *(The NoForeignLand / SeaPeople / cruiser-blog need.)*</w:t>
+      </w:r>
+    </w:p>
+    <w:p>
+      <w:pPr>
+        <w:pStyle w:val="ListBullet"/>
+      </w:pPr>
+      <w:r>
+        <w:rPr>
+          <w:b/>
+        </w:rPr>
+        <w:t>Climate &amp; seasonal context</w:t>
+      </w:r>
+      <w:r>
+        <w:t xml:space="preserve"> — is it the right season, cyclone risk, typical conditions</w:t>
+      </w:r>
+    </w:p>
+    <w:p>
+      <w:r>
+        <w:t>this month.</w:t>
+      </w:r>
+    </w:p>
+    <w:p>
+      <w:pPr>
+        <w:pStyle w:val="ListBullet"/>
+      </w:pPr>
+      <w:r>
+        <w:rPr>
+          <w:b/>
+        </w:rPr>
+        <w:t>Hazards &amp; local knowledge</w:t>
+      </w:r>
+      <w:r>
+        <w:t xml:space="preserve"> — reef passes, bar crossings, surge, theft reports, no-go</w:t>
+      </w:r>
+    </w:p>
+    <w:p>
+      <w:r>
+        <w:t>zones.</w:t>
+      </w:r>
+    </w:p>
+    <w:p>
+      <w:r>
+        <w:t xml:space="preserve">Rendered as a card on the chart and a section on the timeline, </w:t>
+      </w:r>
+      <w:r>
+        <w:rPr>
+          <w:b/>
+        </w:rPr>
+        <w:t>[LLM]</w:t>
+      </w:r>
+      <w:r>
+        <w:t>-written from the</w:t>
+      </w:r>
+    </w:p>
+    <w:p>
+      <w:r>
+        <w:t>sources in §4, always with citations and "last updated."</w:t>
+      </w:r>
+    </w:p>
+    <w:p>
+      <w:pPr>
+        <w:spacing w:before="40" w:after="40"/>
+        <w:pBdr>
+          <w:bottom w:val="single" w:sz="6" w:space="1" w:color="C8D2DA"/>
+        </w:pBdr>
+      </w:pPr>
+    </w:p>
+    <w:p>
+      <w:pPr>
+        <w:pStyle w:val="Heading2"/>
+      </w:pPr>
+      <w:r/>
+      <w:r>
+        <w:t>4. Destination data sources — the honest map</w:t>
+      </w:r>
+    </w:p>
+    <w:p>
+      <w:r>
+        <w:t xml:space="preserve">The hard truth from </w:t>
+      </w:r>
+      <w:r>
+        <w:rPr>
+          <w:color w:val="1F6FA8"/>
+          <w:u w:val="single"/>
+        </w:rPr>
+        <w:t>integrations/noforeignland.md</w:t>
+      </w:r>
+      <w:r>
+        <w:t xml:space="preserve"> and</w:t>
+      </w:r>
+    </w:p>
+    <w:p>
+      <w:r>
+        <w:rPr>
+          <w:color w:val="1F6FA8"/>
+          <w:u w:val="single"/>
+        </w:rPr>
+        <w:t>COMPETITIVE.md</w:t>
+      </w:r>
+      <w:r>
+        <w:t xml:space="preserve">: </w:t>
+      </w:r>
+      <w:r>
+        <w:rPr>
+          <w:b/>
+        </w:rPr>
+        <w:t>the richest community sources are walled.</w:t>
+      </w:r>
+      <w:r>
+        <w:t xml:space="preserve"> So the dossier</w:t>
+      </w:r>
+    </w:p>
+    <w:p>
+      <w:r>
+        <w:t xml:space="preserve">is built primarily on </w:t>
+      </w:r>
+      <w:r>
+        <w:rPr>
+          <w:b/>
+        </w:rPr>
+        <w:t>open + owned</w:t>
+      </w:r>
+      <w:r>
+        <w:t xml:space="preserve"> data, enriched by </w:t>
+      </w:r>
+      <w:r>
+        <w:rPr>
+          <w:b/>
+        </w:rPr>
+        <w:t>RAG over public web</w:t>
+      </w:r>
+      <w:r>
+        <w:t xml:space="preserve"> content, and</w:t>
+      </w:r>
+    </w:p>
+    <w:p>
+      <w:r>
+        <w:t>uses walled sources only where sanctioned.</w:t>
+      </w:r>
+    </w:p>
+    <w:tbl>
+      <w:tblPr>
+        <w:tblStyle w:val="TableGrid"/>
+        <w:tblW w:type="auto" w:w="0"/>
+        <w:jc w:val="center"/>
+        <w:tblLook w:firstColumn="1" w:firstRow="1" w:lastColumn="0" w:lastRow="0" w:noHBand="0" w:noVBand="1" w:val="04A0"/>
+      </w:tblPr>
+      <w:tblGrid>
+        <w:gridCol w:w="2880"/>
+        <w:gridCol w:w="2880"/>
+        <w:gridCol w:w="2880"/>
+      </w:tblGrid>
+      <w:tr>
+        <w:tc>
+          <w:tcPr>
+            <w:tcW w:type="dxa" w:w="2880"/>
+            <w:shd w:val="clear" w:fill="1F6FA8"/>
+          </w:tcPr>
+          <w:p>
+            <w:r>
+              <w:rPr>
+                <w:b/>
+                <w:color w:val="FFFFFF"/>
+                <w:sz w:val="19"/>
+              </w:rPr>
+            </w:r>
+            <w:r>
+              <w:rPr>
+                <w:b/>
+                <w:color w:val="FFFFFF"/>
+                <w:sz w:val="19"/>
+              </w:rPr>
+              <w:t>Source</w:t>
+            </w:r>
+          </w:p>
+        </w:tc>
+        <w:tc>
+          <w:tcPr>
+            <w:tcW w:type="dxa" w:w="2880"/>
+            <w:shd w:val="clear" w:fill="1F6FA8"/>
+          </w:tcPr>
+          <w:p>
+            <w:r>
+              <w:rPr>
+                <w:b/>
+                <w:color w:val="FFFFFF"/>
+                <w:sz w:val="19"/>
+              </w:rPr>
+            </w:r>
+            <w:r>
+              <w:rPr>
+                <w:b/>
+                <w:color w:val="FFFFFF"/>
+                <w:sz w:val="19"/>
+              </w:rPr>
+              <w:t>Wall</w:t>
+            </w:r>
+          </w:p>
+        </w:tc>
+        <w:tc>
+          <w:tcPr>
+            <w:tcW w:type="dxa" w:w="2880"/>
+            <w:shd w:val="clear" w:fill="1F6FA8"/>
+          </w:tcPr>
+          <w:p>
+            <w:r>
+              <w:rPr>
+                <w:b/>
+                <w:color w:val="FFFFFF"/>
+                <w:sz w:val="19"/>
+              </w:rPr>
+            </w:r>
+            <w:r>
+              <w:rPr>
+                <w:b/>
+                <w:color w:val="FFFFFF"/>
+                <w:sz w:val="19"/>
+              </w:rPr>
+              <w:t>Path in Helm</w:t>
+            </w:r>
+          </w:p>
+        </w:tc>
+      </w:tr>
+      <w:tr>
+        <w:tc>
+          <w:tcPr>
+            <w:tcW w:type="dxa" w:w="2880"/>
+          </w:tcPr>
+          <w:p>
+            <w:r>
+              <w:rPr>
+                <w:sz w:val="18"/>
+              </w:rPr>
+            </w:r>
+            <w:r>
+              <w:rPr>
+                <w:b/>
+                <w:sz w:val="18"/>
+              </w:rPr>
+              <w:t>OpenStreetMap / Overpass</w:t>
+            </w:r>
+          </w:p>
+        </w:tc>
+        <w:tc>
+          <w:tcPr>
+            <w:tcW w:type="dxa" w:w="2880"/>
+          </w:tcPr>
+          <w:p>
+            <w:r>
+              <w:rPr>
+                <w:sz w:val="18"/>
+              </w:rPr>
+            </w:r>
+            <w:r>
+              <w:rPr>
+                <w:sz w:val="18"/>
+              </w:rPr>
+              <w:t>open (ODbL)</w:t>
+            </w:r>
+          </w:p>
+        </w:tc>
+        <w:tc>
+          <w:tcPr>
+            <w:tcW w:type="dxa" w:w="2880"/>
+          </w:tcPr>
+          <w:p>
+            <w:r>
+              <w:rPr>
+                <w:sz w:val="18"/>
+              </w:rPr>
+            </w:r>
+            <w:r>
+              <w:rPr>
+                <w:sz w:val="18"/>
+              </w:rPr>
+              <w:t xml:space="preserve">primary services/marinas/fuel/docks — already fetched by </w:t>
+            </w:r>
+            <w:r>
+              <w:rPr>
+                <w:rFonts w:ascii="Consolas" w:hAnsi="Consolas"/>
+                <w:color w:val="9B2C5E"/>
+                <w:sz w:val="18"/>
+              </w:rPr>
+              <w:t>pipeline/fetch_places.py</w:t>
+            </w:r>
+          </w:p>
+        </w:tc>
+      </w:tr>
+      <w:tr>
+        <w:tc>
+          <w:tcPr>
+            <w:tcW w:type="dxa" w:w="2880"/>
+          </w:tcPr>
+          <w:p>
+            <w:r>
+              <w:rPr>
+                <w:sz w:val="18"/>
+              </w:rPr>
+            </w:r>
+            <w:r>
+              <w:rPr>
+                <w:b/>
+                <w:sz w:val="18"/>
+              </w:rPr>
+              <w:t>OpenSeaMap</w:t>
+            </w:r>
+          </w:p>
+        </w:tc>
+        <w:tc>
+          <w:tcPr>
+            <w:tcW w:type="dxa" w:w="2880"/>
+          </w:tcPr>
+          <w:p>
+            <w:r>
+              <w:rPr>
+                <w:sz w:val="18"/>
+              </w:rPr>
+            </w:r>
+            <w:r>
+              <w:rPr>
+                <w:sz w:val="18"/>
+              </w:rPr>
+              <w:t>open (ODbL)</w:t>
+            </w:r>
+          </w:p>
+        </w:tc>
+        <w:tc>
+          <w:tcPr>
+            <w:tcW w:type="dxa" w:w="2880"/>
+          </w:tcPr>
+          <w:p>
+            <w:r>
+              <w:rPr>
+                <w:sz w:val="18"/>
+              </w:rPr>
+            </w:r>
+            <w:r>
+              <w:rPr>
+                <w:sz w:val="18"/>
+              </w:rPr>
+              <w:t>seamarks, harbours, anchorage marks</w:t>
+            </w:r>
+          </w:p>
+        </w:tc>
+      </w:tr>
+      <w:tr>
+        <w:tc>
+          <w:tcPr>
+            <w:tcW w:type="dxa" w:w="2880"/>
+          </w:tcPr>
+          <w:p>
+            <w:r>
+              <w:rPr>
+                <w:sz w:val="18"/>
+              </w:rPr>
+            </w:r>
+            <w:r>
+              <w:rPr>
+                <w:b/>
+                <w:sz w:val="18"/>
+              </w:rPr>
+              <w:t>Helm user pins + reviews</w:t>
+            </w:r>
+          </w:p>
+        </w:tc>
+        <w:tc>
+          <w:tcPr>
+            <w:tcW w:type="dxa" w:w="2880"/>
+          </w:tcPr>
+          <w:p>
+            <w:r>
+              <w:rPr>
+                <w:sz w:val="18"/>
+              </w:rPr>
+            </w:r>
+            <w:r>
+              <w:rPr>
+                <w:b/>
+                <w:sz w:val="18"/>
+              </w:rPr>
+              <w:t>owned</w:t>
+            </w:r>
+          </w:p>
+        </w:tc>
+        <w:tc>
+          <w:tcPr>
+            <w:tcW w:type="dxa" w:w="2880"/>
+          </w:tcPr>
+          <w:p>
+            <w:r>
+              <w:rPr>
+                <w:sz w:val="18"/>
+              </w:rPr>
+            </w:r>
+            <w:r>
+              <w:rPr>
+                <w:sz w:val="18"/>
+              </w:rPr>
+              <w:t>our backend — the community asset we control; grows into the moat</w:t>
+            </w:r>
+          </w:p>
+        </w:tc>
+      </w:tr>
+      <w:tr>
+        <w:tc>
+          <w:tcPr>
+            <w:tcW w:type="dxa" w:w="2880"/>
+          </w:tcPr>
+          <w:p>
+            <w:r>
+              <w:rPr>
+                <w:sz w:val="18"/>
+              </w:rPr>
+            </w:r>
+            <w:r>
+              <w:rPr>
+                <w:b/>
+                <w:sz w:val="18"/>
+              </w:rPr>
+              <w:t>Noonsite</w:t>
+            </w:r>
+            <w:r>
+              <w:rPr>
+                <w:sz w:val="18"/>
+              </w:rPr>
+              <w:t xml:space="preserve"> (port info, formalities)</w:t>
+            </w:r>
+          </w:p>
+        </w:tc>
+        <w:tc>
+          <w:tcPr>
+            <w:tcW w:type="dxa" w:w="2880"/>
+          </w:tcPr>
+          <w:p>
+            <w:r>
+              <w:rPr>
+                <w:sz w:val="18"/>
+              </w:rPr>
+            </w:r>
+            <w:r>
+              <w:rPr>
+                <w:sz w:val="18"/>
+              </w:rPr>
+              <w:t>website, no open API</w:t>
+            </w:r>
+          </w:p>
+        </w:tc>
+        <w:tc>
+          <w:tcPr>
+            <w:tcW w:type="dxa" w:w="2880"/>
+          </w:tcPr>
+          <w:p>
+            <w:r>
+              <w:rPr>
+                <w:sz w:val="18"/>
+              </w:rPr>
+            </w:r>
+            <w:r>
+              <w:rPr>
+                <w:b/>
+                <w:sz w:val="18"/>
+              </w:rPr>
+              <w:t>RAG</w:t>
+            </w:r>
+            <w:r>
+              <w:rPr>
+                <w:sz w:val="18"/>
+              </w:rPr>
+              <w:t xml:space="preserve">: retrieve + summarize + </w:t>
+            </w:r>
+            <w:r>
+              <w:rPr>
+                <w:b/>
+                <w:sz w:val="18"/>
+              </w:rPr>
+              <w:t>cite/link</w:t>
+            </w:r>
+            <w:r>
+              <w:rPr>
+                <w:sz w:val="18"/>
+              </w:rPr>
+              <w:t>, never wholesale republish; honor ToS</w:t>
+            </w:r>
+          </w:p>
+        </w:tc>
+      </w:tr>
+      <w:tr>
+        <w:tc>
+          <w:tcPr>
+            <w:tcW w:type="dxa" w:w="2880"/>
+          </w:tcPr>
+          <w:p>
+            <w:r>
+              <w:rPr>
+                <w:sz w:val="18"/>
+              </w:rPr>
+            </w:r>
+            <w:r>
+              <w:rPr>
+                <w:b/>
+                <w:sz w:val="18"/>
+              </w:rPr>
+              <w:t>Cruiser blogs / forums / guides</w:t>
+            </w:r>
+          </w:p>
+        </w:tc>
+        <w:tc>
+          <w:tcPr>
+            <w:tcW w:type="dxa" w:w="2880"/>
+          </w:tcPr>
+          <w:p>
+            <w:r>
+              <w:rPr>
+                <w:sz w:val="18"/>
+              </w:rPr>
+            </w:r>
+            <w:r>
+              <w:rPr>
+                <w:sz w:val="18"/>
+              </w:rPr>
+              <w:t>public web</w:t>
+            </w:r>
+          </w:p>
+        </w:tc>
+        <w:tc>
+          <w:tcPr>
+            <w:tcW w:type="dxa" w:w="2880"/>
+          </w:tcPr>
+          <w:p>
+            <w:r>
+              <w:rPr>
+                <w:sz w:val="18"/>
+              </w:rPr>
+            </w:r>
+            <w:r>
+              <w:rPr>
+                <w:b/>
+                <w:sz w:val="18"/>
+              </w:rPr>
+              <w:t>RAG</w:t>
+            </w:r>
+            <w:r>
+              <w:rPr>
+                <w:sz w:val="18"/>
+              </w:rPr>
+              <w:t xml:space="preserve"> with attribution + links (deep-research style synthesis)</w:t>
+            </w:r>
+          </w:p>
+        </w:tc>
+      </w:tr>
+      <w:tr>
+        <w:tc>
+          <w:tcPr>
+            <w:tcW w:type="dxa" w:w="2880"/>
+          </w:tcPr>
+          <w:p>
+            <w:r>
+              <w:rPr>
+                <w:sz w:val="18"/>
+              </w:rPr>
+            </w:r>
+            <w:r>
+              <w:rPr>
+                <w:b/>
+                <w:sz w:val="18"/>
+              </w:rPr>
+              <w:t>Climate / pilot charts / tropical</w:t>
+            </w:r>
+          </w:p>
+        </w:tc>
+        <w:tc>
+          <w:tcPr>
+            <w:tcW w:type="dxa" w:w="2880"/>
+          </w:tcPr>
+          <w:p>
+            <w:r>
+              <w:rPr>
+                <w:sz w:val="18"/>
+              </w:rPr>
+            </w:r>
+            <w:r>
+              <w:rPr>
+                <w:sz w:val="18"/>
+              </w:rPr>
+              <w:t>open (NOAA/COGOW/NHC/JTWC)</w:t>
+            </w:r>
+          </w:p>
+        </w:tc>
+        <w:tc>
+          <w:tcPr>
+            <w:tcW w:type="dxa" w:w="2880"/>
+          </w:tcPr>
+          <w:p>
+            <w:r>
+              <w:rPr>
+                <w:sz w:val="18"/>
+              </w:rPr>
+            </w:r>
+            <w:r>
+              <w:rPr>
+                <w:sz w:val="18"/>
+              </w:rPr>
+              <w:t xml:space="preserve">the climatology + tropical tiers from </w:t>
+            </w:r>
+            <w:r>
+              <w:rPr>
+                <w:color w:val="1F6FA8"/>
+                <w:sz w:val="18"/>
+                <w:u w:val="single"/>
+              </w:rPr>
+              <w:t>WEATHER-ROUTING.md</w:t>
+            </w:r>
+          </w:p>
+        </w:tc>
+      </w:tr>
+      <w:tr>
+        <w:tc>
+          <w:tcPr>
+            <w:tcW w:type="dxa" w:w="2880"/>
+          </w:tcPr>
+          <w:p>
+            <w:r>
+              <w:rPr>
+                <w:sz w:val="18"/>
+              </w:rPr>
+            </w:r>
+            <w:r>
+              <w:rPr>
+                <w:b/>
+                <w:sz w:val="18"/>
+              </w:rPr>
+              <w:t>NoForeignLand</w:t>
+            </w:r>
+          </w:p>
+        </w:tc>
+        <w:tc>
+          <w:tcPr>
+            <w:tcW w:type="dxa" w:w="2880"/>
+          </w:tcPr>
+          <w:p>
+            <w:r>
+              <w:rPr>
+                <w:sz w:val="18"/>
+              </w:rPr>
+            </w:r>
+            <w:r>
+              <w:rPr>
+                <w:sz w:val="18"/>
+              </w:rPr>
+              <w:t>semi-walled (no read API)</w:t>
+            </w:r>
+          </w:p>
+        </w:tc>
+        <w:tc>
+          <w:tcPr>
+            <w:tcW w:type="dxa" w:w="2880"/>
+          </w:tcPr>
+          <w:p>
+            <w:r>
+              <w:rPr>
+                <w:sz w:val="18"/>
+              </w:rPr>
+            </w:r>
+            <w:r>
+              <w:rPr>
+                <w:b/>
+                <w:sz w:val="18"/>
+              </w:rPr>
+              <w:t>push</w:t>
+            </w:r>
+            <w:r>
+              <w:rPr>
+                <w:sz w:val="18"/>
+              </w:rPr>
+              <w:t xml:space="preserve"> official; </w:t>
+            </w:r>
+            <w:r>
+              <w:rPr>
+                <w:b/>
+                <w:sz w:val="18"/>
+              </w:rPr>
+              <w:t>pull</w:t>
+            </w:r>
+            <w:r>
+              <w:rPr>
+                <w:sz w:val="18"/>
+              </w:rPr>
+              <w:t xml:space="preserve"> only via partnership, or personal-experimental flag — never scraped in a shipped product</w:t>
+            </w:r>
+          </w:p>
+        </w:tc>
+      </w:tr>
+      <w:tr>
+        <w:tc>
+          <w:tcPr>
+            <w:tcW w:type="dxa" w:w="2880"/>
+          </w:tcPr>
+          <w:p>
+            <w:r>
+              <w:rPr>
+                <w:sz w:val="18"/>
+              </w:rPr>
+            </w:r>
+            <w:r>
+              <w:rPr>
+                <w:b/>
+                <w:sz w:val="18"/>
+              </w:rPr>
+              <w:t>SeaPeople</w:t>
+            </w:r>
+          </w:p>
+        </w:tc>
+        <w:tc>
+          <w:tcPr>
+            <w:tcW w:type="dxa" w:w="2880"/>
+          </w:tcPr>
+          <w:p>
+            <w:r>
+              <w:rPr>
+                <w:sz w:val="18"/>
+              </w:rPr>
+            </w:r>
+            <w:r>
+              <w:rPr>
+                <w:sz w:val="18"/>
+              </w:rPr>
+              <w:t>walled (no public API)</w:t>
+            </w:r>
+          </w:p>
+        </w:tc>
+        <w:tc>
+          <w:tcPr>
+            <w:tcW w:type="dxa" w:w="2880"/>
+          </w:tcPr>
+          <w:p>
+            <w:r>
+              <w:rPr>
+                <w:sz w:val="18"/>
+              </w:rPr>
+            </w:r>
+            <w:r>
+              <w:rPr>
+                <w:b/>
+                <w:sz w:val="18"/>
+              </w:rPr>
+              <w:t>not integrable</w:t>
+            </w:r>
+            <w:r>
+              <w:rPr>
+                <w:sz w:val="18"/>
+              </w:rPr>
+              <w:t xml:space="preserve"> — capture the *need*, serve it from open+owned+RAG instead</w:t>
+            </w:r>
+          </w:p>
+        </w:tc>
+      </w:tr>
+      <w:tr>
+        <w:tc>
+          <w:tcPr>
+            <w:tcW w:type="dxa" w:w="2880"/>
+          </w:tcPr>
+          <w:p>
+            <w:r>
+              <w:rPr>
+                <w:sz w:val="18"/>
+              </w:rPr>
+            </w:r>
+            <w:r>
+              <w:rPr>
+                <w:b/>
+                <w:sz w:val="18"/>
+              </w:rPr>
+              <w:t>ActiveCaptain / Navily</w:t>
+            </w:r>
+            <w:r>
+              <w:rPr>
+                <w:sz w:val="18"/>
+              </w:rPr>
+              <w:t xml:space="preserve"> (anchorage DBs)</w:t>
+            </w:r>
+          </w:p>
+        </w:tc>
+        <w:tc>
+          <w:tcPr>
+            <w:tcW w:type="dxa" w:w="2880"/>
+          </w:tcPr>
+          <w:p>
+            <w:r>
+              <w:rPr>
+                <w:sz w:val="18"/>
+              </w:rPr>
+            </w:r>
+            <w:r>
+              <w:rPr>
+                <w:sz w:val="18"/>
+              </w:rPr>
+              <w:t>walled (Garmin / partnership)</w:t>
+            </w:r>
+          </w:p>
+        </w:tc>
+        <w:tc>
+          <w:tcPr>
+            <w:tcW w:type="dxa" w:w="2880"/>
+          </w:tcPr>
+          <w:p>
+            <w:r>
+              <w:rPr>
+                <w:sz w:val="18"/>
+              </w:rPr>
+            </w:r>
+            <w:r>
+              <w:rPr>
+                <w:sz w:val="18"/>
+              </w:rPr>
+              <w:t>partnership only; the gold-standard card design is the thing to *emulate*, not scrape</w:t>
+            </w:r>
+          </w:p>
+        </w:tc>
+      </w:tr>
+    </w:tbl>
+    <w:p/>
+    <w:p>
+      <w:r>
+        <w:rPr>
+          <w:b/>
+        </w:rPr>
+        <w:t>[honesty]</w:t>
+      </w:r>
+      <w:r>
+        <w:t xml:space="preserve"> The destination briefing must be excellent </w:t>
+      </w:r>
+      <w:r>
+        <w:rPr>
+          <w:b/>
+        </w:rPr>
+        <w:t>without</w:t>
+      </w:r>
+      <w:r>
+        <w:t xml:space="preserve"> NFL/SeaPeople, because</w:t>
+      </w:r>
+    </w:p>
+    <w:p>
+      <w:r>
+        <w:t xml:space="preserve">we can't legally depend on them. The strategy: open data for the map, </w:t>
+      </w:r>
+      <w:r>
+        <w:rPr>
+          <w:b/>
+        </w:rPr>
+        <w:t>Helm-owned reviews</w:t>
+      </w:r>
+    </w:p>
+    <w:p>
+      <w:r>
+        <w:t>for the community layer (so it becomes *ours* over time), Noonsite/blogs via cited RAG for</w:t>
+      </w:r>
+    </w:p>
+    <w:p>
+      <w:r>
+        <w:t>the narrative, and walled DBs only via partnership. SeaPeople's data is off the table; we</w:t>
+      </w:r>
+    </w:p>
+    <w:p>
+      <w:r>
+        <w:t>serve the same *need* — "what do other cruisers say about here" — from sources we're allowed</w:t>
+      </w:r>
+    </w:p>
+    <w:p>
+      <w:r>
+        <w:t>to use.</w:t>
+      </w:r>
+    </w:p>
+    <w:p>
+      <w:pPr>
+        <w:spacing w:before="40" w:after="40"/>
+        <w:pBdr>
+          <w:bottom w:val="single" w:sz="6" w:space="1" w:color="C8D2DA"/>
+        </w:pBdr>
+      </w:pPr>
+    </w:p>
+    <w:p>
+      <w:pPr>
+        <w:pStyle w:val="Heading2"/>
+      </w:pPr>
+      <w:r/>
+      <w:r>
+        <w:t>5. The living timeline — continuous downloads, continuous updates</w:t>
+      </w:r>
+    </w:p>
+    <w:p>
+      <w:r>
+        <w:t xml:space="preserve">The defining property: </w:t>
+      </w:r>
+      <w:r>
+        <w:rPr>
+          <w:b/>
+        </w:rPr>
+        <w:t>briefings are not generated once.</w:t>
+      </w:r>
+      <w:r>
+        <w:t xml:space="preserve"> They are living documents on a</w:t>
+      </w:r>
+    </w:p>
+    <w:p>
+      <w:r>
+        <w:t xml:space="preserve">timeline. There are </w:t>
+      </w:r>
+      <w:r>
+        <w:rPr>
+          <w:b/>
+        </w:rPr>
+        <w:t>two time axes</w:t>
+      </w:r>
+      <w:r>
+        <w:t>, and both matter:</w:t>
+      </w:r>
+    </w:p>
+    <w:p>
+      <w:pPr>
+        <w:shd w:val="clear" w:fill="F2F4F6"/>
+      </w:pPr>
+      <w:r>
+        <w:rPr>
+          <w:rFonts w:ascii="Consolas" w:hAnsi="Consolas"/>
+          <w:color w:val="333333"/>
+          <w:sz w:val="17"/>
+        </w:rPr>
+        <w:t xml:space="preserve">  VALID-TIME  ───────────────────────────────────►  (the passage: where the boat is, when)</w:t>
+        <w:br/>
+        <w:t xml:space="preserve">   now ──── Tue ──── Wed ──── Thu(front) ──── Fri ──── arrival</w:t>
+        <w:br/>
+        <w:t xml:space="preserve">            │</w:t>
+        <w:br/>
+        <w:t xml:space="preserve">  ISSUE-TIME (revisions) ──────────────────────────►  (how the picture changed as data arrived)</w:t>
+        <w:br/>
+        <w:t xml:space="preserve">   GFS 06z  →  ECMWF 12z  →  new community report  →  updated formalities</w:t>
+      </w:r>
+    </w:p>
+    <w:p>
+      <w:pPr>
+        <w:pStyle w:val="ListBullet"/>
+      </w:pPr>
+      <w:r>
+        <w:rPr>
+          <w:b/>
+        </w:rPr>
+        <w:t>Scrub valid-time:</w:t>
+      </w:r>
+      <w:r>
+        <w:t xml:space="preserve"> the boat ghost + weather + arrival dossier all move (§1).</w:t>
+      </w:r>
+    </w:p>
+    <w:p>
+      <w:pPr>
+        <w:pStyle w:val="ListBullet"/>
+      </w:pPr>
+      <w:r>
+        <w:rPr>
+          <w:b/>
+        </w:rPr>
+        <w:t>Track issue-time:</w:t>
+      </w:r>
+      <w:r>
+        <w:t xml:space="preserve"> see how successive downloads changed the story — *"yesterday's run had</w:t>
+      </w:r>
+    </w:p>
+    <w:p>
+      <w:r>
+        <w:t>you clearing the front; the 12z shifted it 6 h earlier."* This is what turns the</w:t>
+      </w:r>
+    </w:p>
+    <w:p>
+      <w:r>
+        <w:t>Maupiti→Fiji misery (re-download, re-read everything, re-derive) into **"here's what</w:t>
+      </w:r>
+    </w:p>
+    <w:p>
+      <w:r>
+        <w:t>changed and whether you should care."**</w:t>
+      </w:r>
+    </w:p>
+    <w:p>
+      <w:pPr>
+        <w:pStyle w:val="ListBullet"/>
+      </w:pPr>
+      <w:r>
+        <w:rPr>
+          <w:b/>
+        </w:rPr>
+        <w:t>Continuous ingestion in the background:</w:t>
+      </w:r>
+      <w:r>
+        <w:t xml:space="preserve"> new GRIB, new community reports, updated</w:t>
+      </w:r>
+    </w:p>
+    <w:p>
+      <w:r>
+        <w:t>formalities, fresh blog posts — fetched whenever there's a pipe (wifi at anchor, sat link</w:t>
+      </w:r>
+    </w:p>
+    <w:p>
+      <w:r>
+        <w:t>offshore), queued and flushed on reconnect.</w:t>
+      </w:r>
+    </w:p>
+    <w:p>
+      <w:pPr>
+        <w:pStyle w:val="ListBullet"/>
+      </w:pPr>
+      <w:r>
+        <w:rPr>
+          <w:b/>
+        </w:rPr>
+        <w:t>Diff, don't dump. [LLM]</w:t>
+      </w:r>
+      <w:r>
+        <w:t xml:space="preserve"> Each update produces a short *delta*, not a fresh wall of data:</w:t>
+      </w:r>
+    </w:p>
+    <w:p>
+      <w:pPr>
+        <w:ind w:left="432"/>
+        <w:pBdr>
+          <w:left w:val="single" w:sz="18" w:space="8" w:color="5BC0FF"/>
+        </w:pBdr>
+      </w:pPr>
+      <w:r>
+        <w:rPr>
+          <w:i/>
+          <w:color w:val="5A6B78"/>
+        </w:rPr>
+        <w:t>*"Update: ECMWF agrees with GFS on the Thursday front now (was diverging). Destination — a cruiser reported the fuel dock at Savusavu is back open as of yesterday."*</w:t>
+      </w:r>
+    </w:p>
+    <w:p>
+      <w:pPr>
+        <w:pStyle w:val="ListBullet"/>
+      </w:pPr>
+      <w:r>
+        <w:rPr>
+          <w:b/>
+        </w:rPr>
+        <w:t>Silent unless it matters:</w:t>
+      </w:r>
+      <w:r>
+        <w:t xml:space="preserve"> most updates change nothing material → no interruption. The</w:t>
+      </w:r>
+    </w:p>
+    <w:p>
+      <w:r>
+        <w:t>one that changes your departure or your landfall earns a notification.</w:t>
+      </w:r>
+    </w:p>
+    <w:p>
+      <w:r>
+        <w:t xml:space="preserve">The timeline is the same control that drives </w:t>
+      </w:r>
+      <w:r>
+        <w:rPr>
+          <w:color w:val="1F6FA8"/>
+          <w:u w:val="single"/>
+        </w:rPr>
+        <w:t>WEATHER-ROUTING.md</w:t>
+      </w:r>
+      <w:r>
+        <w:t>'s</w:t>
+      </w:r>
+    </w:p>
+    <w:p>
+      <w:r>
+        <w:t>scrubber — briefings, weather, and route are three views of one continuously-updating model.</w:t>
+      </w:r>
+    </w:p>
+    <w:p>
+      <w:pPr>
+        <w:spacing w:before="40" w:after="40"/>
+        <w:pBdr>
+          <w:bottom w:val="single" w:sz="6" w:space="1" w:color="C8D2DA"/>
+        </w:pBdr>
+      </w:pPr>
+    </w:p>
+    <w:p>
+      <w:pPr>
+        <w:pStyle w:val="Heading2"/>
+      </w:pPr>
+      <w:r/>
+      <w:r>
+        <w:t>6. LLM / RAG architecture &amp; guardrails</w:t>
+      </w:r>
+    </w:p>
+    <w:p>
+      <w:r>
+        <w:t xml:space="preserve">Briefings are the flagship </w:t>
+      </w:r>
+      <w:r>
+        <w:rPr>
+          <w:b/>
+        </w:rPr>
+        <w:t>LLM-derived</w:t>
+      </w:r>
+      <w:r>
+        <w:t xml:space="preserve"> feature; Steve has already named that this is</w:t>
+      </w:r>
+    </w:p>
+    <w:p>
+      <w:r>
+        <w:t xml:space="preserve">expected. </w:t>
+      </w:r>
+      <w:r>
+        <w:rPr>
+          <w:b/>
+        </w:rPr>
+        <w:t>Default to the latest Claude models</w:t>
+      </w:r>
+      <w:r>
+        <w:t xml:space="preserve"> for cloud-side synthesis; the structured</w:t>
+      </w:r>
+    </w:p>
+    <w:p>
+      <w:r>
+        <w:t>nav/weather + retrieved community text are an ideal tool-use + RAG substrate.</w:t>
+      </w:r>
+    </w:p>
+    <w:p>
+      <w:r>
+        <w:rPr>
+          <w:b/>
+        </w:rPr>
+        <w:t>How it's built:</w:t>
+      </w:r>
+    </w:p>
+    <w:p>
+      <w:pPr>
+        <w:pStyle w:val="ListBullet"/>
+      </w:pPr>
+      <w:r>
+        <w:rPr>
+          <w:b/>
+        </w:rPr>
+        <w:t>Deterministic facts first</w:t>
+      </w:r>
+      <w:r>
+        <w:t xml:space="preserve"> — position, ETA, arrival weather values, tide/current,</w:t>
+      </w:r>
+    </w:p>
+    <w:p>
+      <w:r>
+        <w:t>distances are computed; the LLM narrates them.</w:t>
+      </w:r>
+    </w:p>
+    <w:p>
+      <w:pPr>
+        <w:pStyle w:val="ListBullet"/>
+      </w:pPr>
+      <w:r>
+        <w:rPr>
+          <w:b/>
+        </w:rPr>
+        <w:t>RAG for the narrative</w:t>
+      </w:r>
+      <w:r>
+        <w:t xml:space="preserve"> — retrieve Noonsite/blog/forum/own-review text for the</w:t>
+      </w:r>
+    </w:p>
+    <w:p>
+      <w:r>
+        <w:t xml:space="preserve">destination, ground the summary in it, </w:t>
+      </w:r>
+      <w:r>
+        <w:rPr>
+          <w:b/>
+        </w:rPr>
+        <w:t>cite + link every claim</w:t>
+      </w:r>
+      <w:r>
+        <w:t xml:space="preserve"> (the deep-research</w:t>
+      </w:r>
+    </w:p>
+    <w:p>
+      <w:r>
+        <w:t>pattern).</w:t>
+      </w:r>
+    </w:p>
+    <w:p>
+      <w:pPr>
+        <w:pStyle w:val="ListBullet"/>
+      </w:pPr>
+      <w:r>
+        <w:rPr>
+          <w:b/>
+        </w:rPr>
+        <w:t>Two-axis state</w:t>
+      </w:r>
+      <w:r>
+        <w:t xml:space="preserve"> — the model is fed both the current data and the *delta* since last</w:t>
+      </w:r>
+    </w:p>
+    <w:p>
+      <w:r>
+        <w:t>issue, so it can write "what changed" not just "what is."</w:t>
+      </w:r>
+    </w:p>
+    <w:p>
+      <w:r>
+        <w:rPr>
+          <w:b/>
+        </w:rPr>
+        <w:t>The guardrails (non-negotiable):</w:t>
+      </w:r>
+    </w:p>
+    <w:p>
+      <w:pPr>
+        <w:pStyle w:val="ListNumber"/>
+      </w:pPr>
+      <w:r>
+        <w:rPr>
+          <w:b/>
+        </w:rPr>
+        <w:t>Never invent.</w:t>
+      </w:r>
+      <w:r>
+        <w:t xml:space="preserve"> No fabricated fees, depths, formalities, reviews, or forecasts. If a</w:t>
+      </w:r>
+    </w:p>
+    <w:p>
+      <w:r>
+        <w:t>fact isn't in a source, the briefing says "unknown / verify locally," never a guess.</w:t>
+      </w:r>
+    </w:p>
+    <w:p>
+      <w:r>
+        <w:rPr>
+          <w:b/>
+        </w:rPr>
+        <w:t>[honesty]</w:t>
+      </w:r>
+    </w:p>
+    <w:p>
+      <w:pPr>
+        <w:pStyle w:val="ListNumber"/>
+      </w:pPr>
+      <w:r>
+        <w:rPr>
+          <w:b/>
+        </w:rPr>
+        <w:t>Cite, date, link.</w:t>
+      </w:r>
+      <w:r>
+        <w:t xml:space="preserve"> Every destination claim shows its source and age. "Fuel dock open"</w:t>
+      </w:r>
+    </w:p>
+    <w:p>
+      <w:r>
+        <w:t xml:space="preserve">is worthless without "reported 3 days ago by ⟨source⟩." </w:t>
+      </w:r>
+      <w:r>
+        <w:rPr>
+          <w:b/>
+        </w:rPr>
+        <w:t>[honesty]</w:t>
+      </w:r>
+    </w:p>
+    <w:p>
+      <w:pPr>
+        <w:pStyle w:val="ListNumber"/>
+      </w:pPr>
+      <w:r>
+        <w:rPr>
+          <w:b/>
+        </w:rPr>
+        <w:t>Respect the walls.</w:t>
+      </w:r>
+      <w:r>
+        <w:t xml:space="preserve"> Noonsite/blogs: summarize + attribute + link, don't republish</w:t>
+      </w:r>
+    </w:p>
+    <w:p>
+      <w:r>
+        <w:t xml:space="preserve">wholesale; honor ToS. NFL: partnership/personal only. SeaPeople: not used. </w:t>
+      </w:r>
+      <w:r>
+        <w:rPr>
+          <w:b/>
+        </w:rPr>
+        <w:t>[honesty]</w:t>
+      </w:r>
+    </w:p>
+    <w:p>
+      <w:pPr>
+        <w:pStyle w:val="ListNumber"/>
+      </w:pPr>
+      <w:r>
+        <w:rPr>
+          <w:b/>
+        </w:rPr>
+        <w:t>Owned &gt; scraped.</w:t>
+      </w:r>
+      <w:r>
+        <w:t xml:space="preserve"> Prefer Helm's own pins/reviews; they're legal, fresh, and compound</w:t>
+      </w:r>
+    </w:p>
+    <w:p>
+      <w:r>
+        <w:t>into the moat. Encourage contribution (a review you write enriches the next sailor's</w:t>
+      </w:r>
+    </w:p>
+    <w:p>
+      <w:r>
+        <w:t>dossier).</w:t>
+      </w:r>
+    </w:p>
+    <w:p>
+      <w:pPr>
+        <w:pStyle w:val="ListNumber"/>
+      </w:pPr>
+      <w:r>
+        <w:rPr>
+          <w:b/>
+        </w:rPr>
+        <w:t>Advise, don't act.</w:t>
+      </w:r>
+      <w:r>
+        <w:t xml:space="preserve"> Briefings inform; they never auto-change a route or clear you into</w:t>
+      </w:r>
+    </w:p>
+    <w:p>
+      <w:r>
+        <w:t>a country.</w:t>
+      </w:r>
+    </w:p>
+    <w:p>
+      <w:pPr>
+        <w:pStyle w:val="ListNumber"/>
+      </w:pPr>
+      <w:r>
+        <w:rPr>
+          <w:b/>
+        </w:rPr>
+        <w:t>Offline-aware, and says so.</w:t>
+      </w:r>
+      <w:r>
+        <w:t xml:space="preserve"> Full RAG dockside; cached dossier + smaller on-device model</w:t>
+      </w:r>
+    </w:p>
+    <w:p>
+      <w:r>
+        <w:t>offshore. Always explicit about freshness — a 5-day-old destination dossier must *say* it's</w:t>
+      </w:r>
+    </w:p>
+    <w:p>
+      <w:r>
+        <w:t>5 days old.</w:t>
+      </w:r>
+    </w:p>
+    <w:p>
+      <w:pPr>
+        <w:spacing w:before="40" w:after="40"/>
+        <w:pBdr>
+          <w:bottom w:val="single" w:sz="6" w:space="1" w:color="C8D2DA"/>
+        </w:pBdr>
+      </w:pPr>
+    </w:p>
+    <w:p>
+      <w:pPr>
+        <w:pStyle w:val="Heading2"/>
+      </w:pPr>
+      <w:r/>
+      <w:r>
+        <w:t>7. Build order</w:t>
+      </w:r>
+    </w:p>
+    <w:p>
+      <w:pPr>
+        <w:pStyle w:val="ListNumber"/>
+      </w:pPr>
+      <w:r>
+        <w:rPr>
+          <w:b/>
+        </w:rPr>
+        <w:t>Destination dossier card</w:t>
+      </w:r>
+      <w:r>
+        <w:t xml:space="preserve"> from open+owned data (OSM/OpenSeaMap/Helm pins) — the</w:t>
+      </w:r>
+    </w:p>
+    <w:p>
+      <w:r>
+        <w:t xml:space="preserve">ActiveCaptain/Navily-grade card, ours, legal, offline. *(Extends </w:t>
+      </w:r>
+      <w:r>
+        <w:rPr>
+          <w:rFonts w:ascii="Consolas" w:hAnsi="Consolas"/>
+          <w:color w:val="9B2C5E"/>
+          <w:sz w:val="19"/>
+        </w:rPr>
+        <w:t>fetch_places.py</w:t>
+      </w:r>
+      <w:r>
+        <w:t>.)*</w:t>
+      </w:r>
+    </w:p>
+    <w:p>
+      <w:pPr>
+        <w:pStyle w:val="ListNumber"/>
+      </w:pPr>
+      <w:r>
+        <w:rPr>
+          <w:b/>
+        </w:rPr>
+        <w:t>Arrival weather</w:t>
+      </w:r>
+      <w:r>
+        <w:t xml:space="preserve"> — bind the destination to its ETA forecast (reuse the spacetime</w:t>
+      </w:r>
+    </w:p>
+    <w:p>
+      <w:r>
+        <w:t>engine).</w:t>
+      </w:r>
+    </w:p>
+    <w:p>
+      <w:pPr>
+        <w:pStyle w:val="ListNumber"/>
+      </w:pPr>
+      <w:r>
+        <w:rPr>
+          <w:b/>
+        </w:rPr>
+        <w:t>The living timeline</w:t>
+      </w:r>
+      <w:r>
+        <w:t xml:space="preserve"> — continuous background ingestion + valid-time/issue-time scrub +</w:t>
+      </w:r>
+    </w:p>
+    <w:p>
+      <w:r>
+        <w:t>diff notifications.</w:t>
+      </w:r>
+    </w:p>
+    <w:p>
+      <w:pPr>
+        <w:pStyle w:val="ListNumber"/>
+      </w:pPr>
+      <w:r>
+        <w:rPr>
+          <w:b/>
+        </w:rPr>
+        <w:t>RAG narrative</w:t>
+      </w:r>
+      <w:r>
+        <w:t xml:space="preserve"> — Noonsite/blog/forum synthesis with citations, plus the [LLM] passage +</w:t>
+      </w:r>
+    </w:p>
+    <w:p>
+      <w:r>
+        <w:t>destination briefings.</w:t>
+      </w:r>
+    </w:p>
+    <w:p>
+      <w:pPr>
+        <w:pStyle w:val="ListNumber"/>
+      </w:pPr>
+      <w:r>
+        <w:rPr>
+          <w:b/>
+        </w:rPr>
+        <w:t>Community contribution loop</w:t>
+      </w:r>
+      <w:r>
+        <w:t xml:space="preserve"> — Helm pins/reviews write-back; NFL push; partnership</w:t>
+      </w:r>
+    </w:p>
+    <w:p>
+      <w:r>
+        <w:t>outreach for NFL/ActiveCaptain pull if/when commercial.</w:t>
+      </w:r>
+    </w:p>
+    <w:p>
+      <w:pPr>
+        <w:spacing w:before="40" w:after="40"/>
+        <w:pBdr>
+          <w:bottom w:val="single" w:sz="6" w:space="1" w:color="C8D2DA"/>
+        </w:pBdr>
+      </w:pPr>
+    </w:p>
+    <w:p>
+      <w:r>
+        <w:t>*The need is precise: tell me what the passage will be like, tell me what landfall will be</w:t>
+      </w:r>
+    </w:p>
+    <w:p>
+      <w:r>
+        <w:t>like, and keep both current without me downloading and re-reading everything. The weather</w:t>
+      </w:r>
+    </w:p>
+    <w:p>
+      <w:r>
+        <w:t>half is the spacetime engine; the landfall half is open+owned data plus cited RAG over the</w:t>
+      </w:r>
+    </w:p>
+    <w:p>
+      <w:r>
+        <w:t>cruiser web; and the magic is that both live on one continuously-updating timeline that only</w:t>
+      </w:r>
+    </w:p>
+    <w:p>
+      <w:r>
+        <w:t>interrupts you when the story actually changes.*</w:t>
       </w:r>
     </w:p>
     <w:p>

</xml_diff>

<commit_message>
docs: commit destination dossier + briefings (ADR-0006); add quick-notes/companion split
ADR-0006 accepts the destination dossier + living briefings as a
committed feature ("we are doing it"). Adds the two-depth model Steve
named: terse quick-notes at the helm (glance, decide) vs deep-read on the
iOS companion app (full text, photos, outbound links) — same dataset, two
presentations, not two products. Promotes BRIEFINGS.md to committed and
rebuilds the combined strategy docx.

Co-Authored-By: Claude Opus 4.8 <noreply@anthropic.com>
Claude-Session: https://claude.ai/code/session_01QiBTQdjn7k7KJRRdUortXu
</commit_message>
<xml_diff>
--- a/Helm-Strategy-Brief.docx
+++ b/Helm-Strategy-Brief.docx
@@ -8049,7 +8049,52 @@
           <w:i/>
           <w:color w:val="5A6B78"/>
         </w:rPr>
-        <w:t xml:space="preserve">Status: Spec draft v0.1 · 2026-06-24 · Owner: Steve Ridder The single most-requested capability, in Steve's words: *"Briefings — what to expect along the way, and what to expect once I get there — are my unmet need."* Companion to </w:t>
+        <w:t xml:space="preserve">Status: </w:t>
+      </w:r>
+      <w:r>
+        <w:rPr>
+          <w:b/>
+          <w:i/>
+          <w:color w:val="5A6B78"/>
+        </w:rPr>
+        <w:t>Committed</w:t>
+      </w:r>
+      <w:r>
+        <w:rPr>
+          <w:i/>
+          <w:color w:val="5A6B78"/>
+        </w:rPr>
+        <w:t xml:space="preserve"> (</w:t>
+      </w:r>
+      <w:r>
+        <w:rPr>
+          <w:i/>
+          <w:color w:val="5A6B78"/>
+          <w:u w:val="single"/>
+        </w:rPr>
+        <w:t>ADR-0006</w:t>
+      </w:r>
+      <w:r>
+        <w:rPr>
+          <w:i/>
+          <w:color w:val="5A6B78"/>
+        </w:rPr>
+        <w:t xml:space="preserve">) · spec v0.2 · 2026-06-24 · Owner: Steve Ridder The single most-requested capability, in Steve's words: *"Briefings — what to expect along the way, and what to expect once I get there — are my unmet need… It's what you need when sailing. We need this!!"* Wireframe: </w:t>
+      </w:r>
+      <w:r>
+        <w:rPr>
+          <w:i/>
+          <w:color w:val="5A6B78"/>
+          <w:u w:val="single"/>
+        </w:rPr>
+        <w:t>mockups/destination-dossier.html</w:t>
+      </w:r>
+      <w:r>
+        <w:rPr>
+          <w:i/>
+          <w:color w:val="5A6B78"/>
+        </w:rPr>
+        <w:t xml:space="preserve">. Companion to </w:t>
       </w:r>
       <w:r>
         <w:rPr>
@@ -8874,6 +8919,490 @@
           <w:bottom w:val="single" w:sz="6" w:space="1" w:color="C8D2DA"/>
         </w:pBdr>
       </w:pPr>
+    </w:p>
+    <w:p>
+      <w:pPr>
+        <w:pStyle w:val="Heading2"/>
+      </w:pPr>
+      <w:r/>
+      <w:r>
+        <w:t>3b. Two depths, one dataset — quick notes at the helm, deep read on the companion</w:t>
+      </w:r>
+    </w:p>
+    <w:p>
+      <w:r>
+        <w:t xml:space="preserve">The dossier exists at </w:t>
+      </w:r>
+      <w:r>
+        <w:rPr>
+          <w:b/>
+        </w:rPr>
+        <w:t>two depths of the same data</w:t>
+      </w:r>
+      <w:r>
+        <w:t>, matched to where you are and what you</w:t>
+      </w:r>
+    </w:p>
+    <w:p>
+      <w:r>
+        <w:t>can safely do:</w:t>
+      </w:r>
+    </w:p>
+    <w:tbl>
+      <w:tblPr>
+        <w:tblStyle w:val="TableGrid"/>
+        <w:tblW w:type="auto" w:w="0"/>
+        <w:jc w:val="center"/>
+        <w:tblLook w:firstColumn="1" w:firstRow="1" w:lastColumn="0" w:lastRow="0" w:noHBand="0" w:noVBand="1" w:val="04A0"/>
+      </w:tblPr>
+      <w:tblGrid>
+        <w:gridCol w:w="2880"/>
+        <w:gridCol w:w="2880"/>
+        <w:gridCol w:w="2880"/>
+      </w:tblGrid>
+      <w:tr>
+        <w:tc>
+          <w:tcPr>
+            <w:tcW w:type="dxa" w:w="2880"/>
+            <w:shd w:val="clear" w:fill="1F6FA8"/>
+          </w:tcPr>
+          <w:p>
+            <w:r>
+              <w:rPr>
+                <w:b/>
+                <w:color w:val="FFFFFF"/>
+                <w:sz w:val="19"/>
+              </w:rPr>
+            </w:r>
+          </w:p>
+        </w:tc>
+        <w:tc>
+          <w:tcPr>
+            <w:tcW w:type="dxa" w:w="2880"/>
+            <w:shd w:val="clear" w:fill="1F6FA8"/>
+          </w:tcPr>
+          <w:p>
+            <w:r>
+              <w:rPr>
+                <w:b/>
+                <w:color w:val="FFFFFF"/>
+                <w:sz w:val="19"/>
+              </w:rPr>
+            </w:r>
+            <w:r>
+              <w:rPr>
+                <w:b/>
+                <w:color w:val="FFFFFF"/>
+                <w:sz w:val="19"/>
+              </w:rPr>
+              <w:t>At the helm</w:t>
+            </w:r>
+            <w:r>
+              <w:rPr>
+                <w:b/>
+                <w:color w:val="FFFFFF"/>
+                <w:sz w:val="19"/>
+              </w:rPr>
+              <w:t xml:space="preserve"> (chartplotter / chart canvas)</w:t>
+            </w:r>
+          </w:p>
+        </w:tc>
+        <w:tc>
+          <w:tcPr>
+            <w:tcW w:type="dxa" w:w="2880"/>
+            <w:shd w:val="clear" w:fill="1F6FA8"/>
+          </w:tcPr>
+          <w:p>
+            <w:r>
+              <w:rPr>
+                <w:b/>
+                <w:color w:val="FFFFFF"/>
+                <w:sz w:val="19"/>
+              </w:rPr>
+            </w:r>
+            <w:r>
+              <w:rPr>
+                <w:b/>
+                <w:color w:val="FFFFFF"/>
+                <w:sz w:val="19"/>
+              </w:rPr>
+              <w:t>iOS companion app</w:t>
+            </w:r>
+          </w:p>
+        </w:tc>
+      </w:tr>
+      <w:tr>
+        <w:tc>
+          <w:tcPr>
+            <w:tcW w:type="dxa" w:w="2880"/>
+          </w:tcPr>
+          <w:p>
+            <w:r>
+              <w:rPr>
+                <w:sz w:val="18"/>
+              </w:rPr>
+            </w:r>
+            <w:r>
+              <w:rPr>
+                <w:sz w:val="18"/>
+              </w:rPr>
+              <w:t>Purpose</w:t>
+            </w:r>
+          </w:p>
+        </w:tc>
+        <w:tc>
+          <w:tcPr>
+            <w:tcW w:type="dxa" w:w="2880"/>
+          </w:tcPr>
+          <w:p>
+            <w:r>
+              <w:rPr>
+                <w:sz w:val="18"/>
+              </w:rPr>
+            </w:r>
+            <w:r>
+              <w:rPr>
+                <w:sz w:val="18"/>
+              </w:rPr>
+              <w:t xml:space="preserve">a </w:t>
+            </w:r>
+            <w:r>
+              <w:rPr>
+                <w:b/>
+                <w:sz w:val="18"/>
+              </w:rPr>
+              <w:t>glance</w:t>
+            </w:r>
+            <w:r>
+              <w:rPr>
+                <w:sz w:val="18"/>
+              </w:rPr>
+              <w:t xml:space="preserve"> while sailing — decide, don't read</w:t>
+            </w:r>
+          </w:p>
+        </w:tc>
+        <w:tc>
+          <w:tcPr>
+            <w:tcW w:type="dxa" w:w="2880"/>
+          </w:tcPr>
+          <w:p>
+            <w:r>
+              <w:rPr>
+                <w:sz w:val="18"/>
+              </w:rPr>
+            </w:r>
+            <w:r>
+              <w:rPr>
+                <w:b/>
+                <w:sz w:val="18"/>
+              </w:rPr>
+              <w:t>research</w:t>
+            </w:r>
+            <w:r>
+              <w:rPr>
+                <w:sz w:val="18"/>
+              </w:rPr>
+              <w:t xml:space="preserve"> — dockside, off-watch, in the bunk</w:t>
+            </w:r>
+          </w:p>
+        </w:tc>
+      </w:tr>
+      <w:tr>
+        <w:tc>
+          <w:tcPr>
+            <w:tcW w:type="dxa" w:w="2880"/>
+          </w:tcPr>
+          <w:p>
+            <w:r>
+              <w:rPr>
+                <w:sz w:val="18"/>
+              </w:rPr>
+            </w:r>
+            <w:r>
+              <w:rPr>
+                <w:sz w:val="18"/>
+              </w:rPr>
+              <w:t>Content</w:t>
+            </w:r>
+          </w:p>
+        </w:tc>
+        <w:tc>
+          <w:tcPr>
+            <w:tcW w:type="dxa" w:w="2880"/>
+          </w:tcPr>
+          <w:p>
+            <w:r>
+              <w:rPr>
+                <w:sz w:val="18"/>
+              </w:rPr>
+            </w:r>
+            <w:r>
+              <w:rPr>
+                <w:sz w:val="18"/>
+              </w:rPr>
+              <w:t xml:space="preserve">terse </w:t>
+            </w:r>
+            <w:r>
+              <w:rPr>
+                <w:b/>
+                <w:sz w:val="18"/>
+              </w:rPr>
+              <w:t>quick notes</w:t>
+            </w:r>
+            <w:r>
+              <w:rPr>
+                <w:sz w:val="18"/>
+              </w:rPr>
+              <w:t>: key facts, status, source + freshness chips</w:t>
+            </w:r>
+          </w:p>
+        </w:tc>
+        <w:tc>
+          <w:tcPr>
+            <w:tcW w:type="dxa" w:w="2880"/>
+          </w:tcPr>
+          <w:p>
+            <w:r>
+              <w:rPr>
+                <w:sz w:val="18"/>
+              </w:rPr>
+            </w:r>
+            <w:r>
+              <w:rPr>
+                <w:sz w:val="18"/>
+              </w:rPr>
+              <w:t xml:space="preserve">full briefing text, </w:t>
+            </w:r>
+            <w:r>
+              <w:rPr>
+                <w:b/>
+                <w:sz w:val="18"/>
+              </w:rPr>
+              <w:t>photos</w:t>
+            </w:r>
+            <w:r>
+              <w:rPr>
+                <w:sz w:val="18"/>
+              </w:rPr>
+              <w:t xml:space="preserve">, reviews, and </w:t>
+            </w:r>
+            <w:r>
+              <w:rPr>
+                <w:b/>
+                <w:sz w:val="18"/>
+              </w:rPr>
+              <w:t>outbound links</w:t>
+            </w:r>
+            <w:r>
+              <w:rPr>
+                <w:sz w:val="18"/>
+              </w:rPr>
+              <w:t xml:space="preserve"> to sources</w:t>
+            </w:r>
+          </w:p>
+        </w:tc>
+      </w:tr>
+      <w:tr>
+        <w:tc>
+          <w:tcPr>
+            <w:tcW w:type="dxa" w:w="2880"/>
+          </w:tcPr>
+          <w:p>
+            <w:r>
+              <w:rPr>
+                <w:sz w:val="18"/>
+              </w:rPr>
+            </w:r>
+            <w:r>
+              <w:rPr>
+                <w:sz w:val="18"/>
+              </w:rPr>
+              <w:t>Form</w:t>
+            </w:r>
+          </w:p>
+        </w:tc>
+        <w:tc>
+          <w:tcPr>
+            <w:tcW w:type="dxa" w:w="2880"/>
+          </w:tcPr>
+          <w:p>
+            <w:r>
+              <w:rPr>
+                <w:sz w:val="18"/>
+              </w:rPr>
+            </w:r>
+            <w:r>
+              <w:rPr>
+                <w:sz w:val="18"/>
+              </w:rPr>
+              <w:t>the dossier card + timeline (the wireframe)</w:t>
+            </w:r>
+          </w:p>
+        </w:tc>
+        <w:tc>
+          <w:tcPr>
+            <w:tcW w:type="dxa" w:w="2880"/>
+          </w:tcPr>
+          <w:p>
+            <w:r>
+              <w:rPr>
+                <w:sz w:val="18"/>
+              </w:rPr>
+            </w:r>
+            <w:r>
+              <w:rPr>
+                <w:sz w:val="18"/>
+              </w:rPr>
+              <w:t>scrollable articles, the cited originals (Noonsite/blogs/charts)</w:t>
+            </w:r>
+          </w:p>
+        </w:tc>
+      </w:tr>
+      <w:tr>
+        <w:tc>
+          <w:tcPr>
+            <w:tcW w:type="dxa" w:w="2880"/>
+          </w:tcPr>
+          <w:p>
+            <w:r>
+              <w:rPr>
+                <w:sz w:val="18"/>
+              </w:rPr>
+            </w:r>
+            <w:r>
+              <w:rPr>
+                <w:sz w:val="18"/>
+              </w:rPr>
+              <w:t>Reading load</w:t>
+            </w:r>
+          </w:p>
+        </w:tc>
+        <w:tc>
+          <w:tcPr>
+            <w:tcW w:type="dxa" w:w="2880"/>
+          </w:tcPr>
+          <w:p>
+            <w:r>
+              <w:rPr>
+                <w:sz w:val="18"/>
+              </w:rPr>
+            </w:r>
+            <w:r>
+              <w:rPr>
+                <w:sz w:val="18"/>
+              </w:rPr>
+              <w:t>seconds, arm's-length legible</w:t>
+            </w:r>
+          </w:p>
+        </w:tc>
+        <w:tc>
+          <w:tcPr>
+            <w:tcW w:type="dxa" w:w="2880"/>
+          </w:tcPr>
+          <w:p>
+            <w:r>
+              <w:rPr>
+                <w:sz w:val="18"/>
+              </w:rPr>
+            </w:r>
+            <w:r>
+              <w:rPr>
+                <w:sz w:val="18"/>
+              </w:rPr>
+              <w:t>minutes, lean-back</w:t>
+            </w:r>
+          </w:p>
+        </w:tc>
+      </w:tr>
+      <w:tr>
+        <w:tc>
+          <w:tcPr>
+            <w:tcW w:type="dxa" w:w="2880"/>
+          </w:tcPr>
+          <w:p>
+            <w:r>
+              <w:rPr>
+                <w:sz w:val="18"/>
+              </w:rPr>
+            </w:r>
+            <w:r>
+              <w:rPr>
+                <w:sz w:val="18"/>
+              </w:rPr>
+              <w:t>Where the heavy work runs</w:t>
+            </w:r>
+          </w:p>
+        </w:tc>
+        <w:tc>
+          <w:tcPr>
+            <w:tcW w:type="dxa" w:w="2880"/>
+          </w:tcPr>
+          <w:p>
+            <w:r>
+              <w:rPr>
+                <w:sz w:val="18"/>
+              </w:rPr>
+            </w:r>
+            <w:r>
+              <w:rPr>
+                <w:sz w:val="18"/>
+              </w:rPr>
+              <w:t>shows the distilled result</w:t>
+            </w:r>
+          </w:p>
+        </w:tc>
+        <w:tc>
+          <w:tcPr>
+            <w:tcW w:type="dxa" w:w="2880"/>
+          </w:tcPr>
+          <w:p>
+            <w:r>
+              <w:rPr>
+                <w:sz w:val="18"/>
+              </w:rPr>
+            </w:r>
+            <w:r>
+              <w:rPr>
+                <w:sz w:val="18"/>
+              </w:rPr>
+              <w:t>can run heavier RAG / link-following</w:t>
+            </w:r>
+          </w:p>
+        </w:tc>
+      </w:tr>
+    </w:tbl>
+    <w:p/>
+    <w:p>
+      <w:r>
+        <w:t>This is the model Steve named: *"even if the iOS companion app is where you read stuff with</w:t>
+      </w:r>
+    </w:p>
+    <w:p>
+      <w:r>
+        <w:t>links for more info, and these are more quick notes."* **Same dataset, two presentations —</w:t>
+      </w:r>
+    </w:p>
+    <w:p>
+      <w:r>
+        <w:t>not two products.** The helm surface must stay terse (a wall of text underway is a failure);</w:t>
+      </w:r>
+    </w:p>
+    <w:p>
+      <w:r>
+        <w:t>the companion is where depth and links live. Committed in</w:t>
+      </w:r>
+    </w:p>
+    <w:p>
+      <w:r>
+        <w:rPr>
+          <w:color w:val="1F6FA8"/>
+          <w:u w:val="single"/>
+        </w:rPr>
+        <w:t>ADR-0006</w:t>
+      </w:r>
+      <w:r>
+        <w:t>.</w:t>
+      </w:r>
     </w:p>
     <w:p>
       <w:pPr>

</xml_diff>

<commit_message>
docs: name + commit the spacetime probe (ADR-0007) — any layer in the slice
SPACETIME-PROBE.md + ADR-0007 generalize the per-domain fusion (weather
field, destination dossier) into one keystone primitive: every layer has a
visual face AND a probe face (sample(lat,lon,t) -> value+source+freshness+
confidence); a point/path/region+time resolves to one source-tagged slice;
selectable layers double as slice filters; one ReAct narrator speaks it,
honestly and cited. Records the rule Steve set: any layer is part of the
space/time slice (a layer isn't done until it can be sampled). Cross-links
WEATHER-ROUTING §1 and BRIEFINGS as instances; maps to backend
context.py/agents.py + /context + /narrate. Rebuilds the combined brief.

Co-Authored-By: Claude Opus 4.8 <noreply@anthropic.com>
Claude-Session: https://claude.ai/code/session_01QiBTQdjn7k7KJRRdUortXu
</commit_message>
<xml_diff>
--- a/Helm-Strategy-Brief.docx
+++ b/Helm-Strategy-Brief.docx
@@ -5736,22 +5736,22 @@
       </w:pPr>
       <w:r/>
       <w:r>
-        <w:t>Helm — Weather, Routing &amp; the Spacetime Engine</w:t>
-      </w:r>
-    </w:p>
-    <w:p>
-      <w:r>
-        <w:t>**Sample the weather along your *future track*, not at a fixed clock time. Make every</w:t>
-      </w:r>
-    </w:p>
-    <w:p>
-      <w:r>
-        <w:t>forecast update magic-in-the-background. Make ocean routing easy enough that you stop</w:t>
-      </w:r>
-    </w:p>
-    <w:p>
-      <w:r>
-        <w:t>juggling eight apps — and honest enough to tell you when to still call a human.**</w:t>
+        <w:t>Helm — The Spacetime Probe</w:t>
+      </w:r>
+    </w:p>
+    <w:p>
+      <w:r>
+        <w:t>**Every layer is part of the space/time slice. Pick a point (or a path, or a region) in</w:t>
+      </w:r>
+    </w:p>
+    <w:p>
+      <w:r>
+        <w:t>space and time, and Helm fuses *all* layers there into one source-tagged slice that the AI</w:t>
+      </w:r>
+    </w:p>
+    <w:p>
+      <w:r>
+        <w:t>agent narrates.**</w:t>
       </w:r>
     </w:p>
     <w:p>
@@ -5766,7 +5766,22 @@
           <w:i/>
           <w:color w:val="5A6B78"/>
         </w:rPr>
-        <w:t xml:space="preserve">Status: Spec draft v0.1 · 2026-06-24 · Owner: Steve Ridder Companion to </w:t>
+        <w:t xml:space="preserve">Status: </w:t>
+      </w:r>
+      <w:r>
+        <w:rPr>
+          <w:b/>
+          <w:i/>
+          <w:color w:val="5A6B78"/>
+        </w:rPr>
+        <w:t>Committed</w:t>
+      </w:r>
+      <w:r>
+        <w:rPr>
+          <w:i/>
+          <w:color w:val="5A6B78"/>
+        </w:rPr>
+        <w:t xml:space="preserve"> (</w:t>
       </w:r>
       <w:r>
         <w:rPr>
@@ -5774,14 +5789,14 @@
           <w:color w:val="5A6B78"/>
           <w:u w:val="single"/>
         </w:rPr>
-        <w:t>VISION.md</w:t>
+        <w:t>ADR-0007</w:t>
       </w:r>
       <w:r>
         <w:rPr>
           <w:i/>
           <w:color w:val="5A6B78"/>
         </w:rPr>
-        <w:t xml:space="preserve"> (§6 Weather, §8 Copilot) and </w:t>
+        <w:t>) · spec v0.1 · 2026-06-24 · Owner: Steve Ridder The generalization of two things we'd already written per-domain — the *weather* field (</w:t>
       </w:r>
       <w:r>
         <w:rPr>
@@ -5789,14 +5804,45 @@
           <w:color w:val="5A6B78"/>
           <w:u w:val="single"/>
         </w:rPr>
-        <w:t>WEATHER.md</w:t>
+        <w:t>WEATHER-ROUTING.md §1</w:t>
       </w:r>
       <w:r>
         <w:rPr>
           <w:i/>
           <w:color w:val="5A6B78"/>
         </w:rPr>
-        <w:t xml:space="preserve"> (the own-GRIB rendering stack). Born from a real 18-day Maupiti→Fiji passage and the misery of constantly re-downloading GRIB, opening tabs, and re-deriving the route by hand.  </w:t>
+        <w:t xml:space="preserve">, </w:t>
+      </w:r>
+      <w:r>
+        <w:rPr>
+          <w:rFonts w:ascii="Consolas" w:hAnsi="Consolas"/>
+          <w:i/>
+          <w:color w:val="5A6B78"/>
+          <w:sz w:val="19"/>
+        </w:rPr>
+        <w:t>W(lat,lon,t)</w:t>
+      </w:r>
+      <w:r>
+        <w:rPr>
+          <w:i/>
+          <w:color w:val="5A6B78"/>
+        </w:rPr>
+        <w:t>) and the *destination* dossier (</w:t>
+      </w:r>
+      <w:r>
+        <w:rPr>
+          <w:i/>
+          <w:color w:val="5A6B78"/>
+          <w:u w:val="single"/>
+        </w:rPr>
+        <w:t>BRIEFINGS.md</w:t>
+      </w:r>
+      <w:r>
+        <w:rPr>
+          <w:i/>
+          <w:color w:val="5A6B78"/>
+        </w:rPr>
+        <w:t xml:space="preserve">) — into one primitive: </w:t>
       </w:r>
       <w:r>
         <w:rPr>
@@ -5804,14 +5850,14 @@
           <w:i/>
           <w:color w:val="5A6B78"/>
         </w:rPr>
-        <w:t>Honesty note up front:</w:t>
+        <w:t>any</w:t>
       </w:r>
       <w:r>
         <w:rPr>
           <w:i/>
           <w:color w:val="5A6B78"/>
         </w:rPr>
-        <w:t xml:space="preserve"> a large share of the "magic" in this document is </w:t>
+        <w:t xml:space="preserve"> layer, </w:t>
       </w:r>
       <w:r>
         <w:rPr>
@@ -5819,44 +5865,108 @@
           <w:i/>
           <w:color w:val="5A6B78"/>
         </w:rPr>
-        <w:t>LLM-derived</w:t>
+        <w:t>any</w:t>
       </w:r>
       <w:r>
         <w:rPr>
           <w:i/>
           <w:color w:val="5A6B78"/>
         </w:rPr>
-        <w:t xml:space="preserve"> — briefings, the diff narration, departure advice, routing interpretation. Those parts are tagged </w:t>
-      </w:r>
-      <w:r>
-        <w:rPr>
-          <w:b/>
+        <w:t xml:space="preserve"> point in spacetime, fused and narrated. Realized in code by </w:t>
+      </w:r>
+      <w:r>
+        <w:rPr>
           <w:i/>
           <w:color w:val="5A6B78"/>
-        </w:rPr>
-        <w:t>[LLM]</w:t>
+          <w:u w:val="single"/>
+        </w:rPr>
+        <w:t>../backend/context.py</w:t>
       </w:r>
       <w:r>
         <w:rPr>
           <w:i/>
           <w:color w:val="5A6B78"/>
         </w:rPr>
-        <w:t xml:space="preserve"> and governed by the guardrails in §7. The numbers underneath them (position, ETA, isochrones, CPA, wind/sea values) are </w:t>
-      </w:r>
-      <w:r>
-        <w:rPr>
-          <w:b/>
+        <w:t xml:space="preserve"> (</w:t>
+      </w:r>
+      <w:r>
+        <w:rPr>
+          <w:rFonts w:ascii="Consolas" w:hAnsi="Consolas"/>
           <w:i/>
           <w:color w:val="5A6B78"/>
-        </w:rPr>
-        <w:t>deterministic</w:t>
+          <w:sz w:val="19"/>
+        </w:rPr>
+        <w:t>resolve_context</w:t>
       </w:r>
       <w:r>
         <w:rPr>
           <w:i/>
           <w:color w:val="5A6B78"/>
         </w:rPr>
-        <w:t xml:space="preserve"> and computed, never generated. The LLM *explains and sequences*; it never *invents* a forecast or a fix.</w:t>
+        <w:t xml:space="preserve">) + </w:t>
+      </w:r>
+      <w:r>
+        <w:rPr>
+          <w:rFonts w:ascii="Consolas" w:hAnsi="Consolas"/>
+          <w:i/>
+          <w:color w:val="5A6B78"/>
+          <w:sz w:val="19"/>
+        </w:rPr>
+        <w:t>/context</w:t>
+      </w:r>
+      <w:r>
+        <w:rPr>
+          <w:i/>
+          <w:color w:val="5A6B78"/>
+        </w:rPr>
+        <w:t xml:space="preserve"> + </w:t>
+      </w:r>
+      <w:r>
+        <w:rPr>
+          <w:rFonts w:ascii="Consolas" w:hAnsi="Consolas"/>
+          <w:i/>
+          <w:color w:val="5A6B78"/>
+          <w:sz w:val="19"/>
+        </w:rPr>
+        <w:t>/narrate</w:t>
+      </w:r>
+      <w:r>
+        <w:rPr>
+          <w:i/>
+          <w:color w:val="5A6B78"/>
+        </w:rPr>
+        <w:t xml:space="preserve">, narrated by </w:t>
+      </w:r>
+      <w:r>
+        <w:rPr>
+          <w:i/>
+          <w:color w:val="5A6B78"/>
+          <w:u w:val="single"/>
+        </w:rPr>
+        <w:t>../backend/agents.py</w:t>
+      </w:r>
+      <w:r>
+        <w:rPr>
+          <w:i/>
+          <w:color w:val="5A6B78"/>
+        </w:rPr>
+        <w:t xml:space="preserve"> (</w:t>
+      </w:r>
+      <w:r>
+        <w:rPr>
+          <w:rFonts w:ascii="Consolas" w:hAnsi="Consolas"/>
+          <w:i/>
+          <w:color w:val="5A6B78"/>
+          <w:sz w:val="19"/>
+        </w:rPr>
+        <w:t>narrate_context</w:t>
+      </w:r>
+      <w:r>
+        <w:rPr>
+          <w:i/>
+          <w:color w:val="5A6B78"/>
+        </w:rPr>
+        <w:t>). Honesty spine: deterministic facts computed, the agent narrates; cite + date + confidence; respect every source wall; supplemental-not-primary; offline-aware.</w:t>
       </w:r>
     </w:p>
     <w:p>
@@ -5873,50 +5983,17 @@
       </w:pPr>
       <w:r/>
       <w:r>
-        <w:t>1. The core idea — spacetime coupling</w:t>
-      </w:r>
-    </w:p>
-    <w:p>
-      <w:r>
-        <w:t xml:space="preserve">Every weather app shows the field at a </w:t>
-      </w:r>
-      <w:r>
-        <w:rPr>
-          <w:b/>
-        </w:rPr>
-        <w:t>fixed wall-clock time</w:t>
-      </w:r>
-      <w:r>
-        <w:t xml:space="preserve"> and makes the human do the</w:t>
-      </w:r>
-    </w:p>
-    <w:p>
-      <w:r>
-        <w:t>projection: "the front arrives Thursday 14:00 — where will *I* be Thursday 14:00?" That</w:t>
-      </w:r>
-    </w:p>
-    <w:p>
-      <w:r>
-        <w:t>mental projection, repeated across wind/gust/swell/rain and re-done after every GRIB</w:t>
-      </w:r>
-    </w:p>
-    <w:p>
-      <w:r>
-        <w:t>download, *is* the work that exhausts passage-makers.</w:t>
-      </w:r>
-    </w:p>
-    <w:p>
-      <w:r>
-        <w:t xml:space="preserve">Reframe it. Your boat is a </w:t>
-      </w:r>
-      <w:r>
-        <w:rPr>
-          <w:b/>
-        </w:rPr>
-        <w:t>worldline</w:t>
-      </w:r>
-      <w:r>
-        <w:t xml:space="preserve"> — position as a function of time, </w:t>
+        <w:t>1. The idea</w:t>
+      </w:r>
+    </w:p>
+    <w:p>
+      <w:r>
+        <w:t>Helm's data is not a pile of separate apps or even separate overlays — it is **one fused</w:t>
+      </w:r>
+    </w:p>
+    <w:p>
+      <w:r>
+        <w:t>field over space and time.** Weather already is (</w:t>
       </w:r>
       <w:r>
         <w:rPr>
@@ -5924,24 +6001,1145 @@
           <w:color w:val="9B2C5E"/>
           <w:sz w:val="19"/>
         </w:rPr>
-        <w:t>P(t)</w:t>
-      </w:r>
-      <w:r>
-        <w:t>. Weather</w:t>
-      </w:r>
-    </w:p>
-    <w:p>
-      <w:r>
-        <w:t xml:space="preserve">is a </w:t>
+        <w:t>W(lat, lon, t)</w:t>
+      </w:r>
+      <w:r>
+        <w:t>). The insight here is that</w:t>
+      </w:r>
+    </w:p>
+    <w:p>
+      <w:r>
+        <w:t>*everything else is too*: depth, places, reviews, saved pins, climate, tides, AIS, the</w:t>
+      </w:r>
+    </w:p>
+    <w:p>
+      <w:r>
+        <w:t xml:space="preserve">NFL slot — each is a </w:t>
       </w:r>
       <w:r>
         <w:rPr>
           <w:b/>
         </w:rPr>
-        <w:t>4-D field</w:t>
-      </w:r>
-      <w:r>
-        <w:t xml:space="preserve"> — </w:t>
+        <w:t>function of where and when.</w:t>
+      </w:r>
+    </w:p>
+    <w:p>
+      <w:r>
+        <w:t xml:space="preserve">So the core query is a point in spacetime, and the core answer is a </w:t>
+      </w:r>
+      <w:r>
+        <w:rPr>
+          <w:b/>
+        </w:rPr>
+        <w:t>slice</w:t>
+      </w:r>
+      <w:r>
+        <w:t>: the value of</w:t>
+      </w:r>
+    </w:p>
+    <w:p>
+      <w:r>
+        <w:t>*every* layer at that point, source-tagged, which the agent then narrates.</w:t>
+      </w:r>
+    </w:p>
+    <w:p>
+      <w:pPr>
+        <w:shd w:val="clear" w:fill="F2F4F6"/>
+      </w:pPr>
+      <w:r>
+        <w:rPr>
+          <w:rFonts w:ascii="Consolas" w:hAnsi="Consolas"/>
+          <w:color w:val="333333"/>
+          <w:sz w:val="17"/>
+        </w:rPr>
+        <w:t xml:space="preserve">  query  = a point (lat, lon, t)   ·or·  a path P(t) (your route)   ·or·  a region (bbox, t)</w:t>
+        <w:br/>
+        <w:t xml:space="preserve">                                   │</w:t>
+        <w:br/>
+        <w:t xml:space="preserve">                                   ▼</w:t>
+        <w:br/>
+        <w:t xml:space="preserve">            ┌──────────────  THE SLICE  ──────────────┐</w:t>
+        <w:br/>
+        <w:t xml:space="preserve">            │  every layer sampled at the query,       │</w:t>
+        <w:br/>
+        <w:t xml:space="preserve">            │  each tagged {value, source, freshness,  │</w:t>
+        <w:br/>
+        <w:t xml:space="preserve">            │  confidence}                             │</w:t>
+        <w:br/>
+        <w:t xml:space="preserve">            └───────────────────┬─────────────────────┘</w:t>
+        <w:br/>
+        <w:t xml:space="preserve">                                ▼</w:t>
+        <w:br/>
+        <w:t xml:space="preserve">                   ReAct narrator (agent) → plain-language briefing, cited, honest</w:t>
+      </w:r>
+    </w:p>
+    <w:p>
+      <w:r>
+        <w:t>This is why "tap a point, scrub a time → it narrates the weather, climate, NFL data, the</w:t>
+      </w:r>
+    </w:p>
+    <w:p>
+      <w:r>
+        <w:t>anchorage reviews, the depth" is a *single call*, not a feature per data type.</w:t>
+      </w:r>
+    </w:p>
+    <w:p>
+      <w:pPr>
+        <w:spacing w:before="40" w:after="40"/>
+        <w:pBdr>
+          <w:bottom w:val="single" w:sz="6" w:space="1" w:color="C8D2DA"/>
+        </w:pBdr>
+      </w:pPr>
+    </w:p>
+    <w:p>
+      <w:pPr>
+        <w:pStyle w:val="Heading2"/>
+      </w:pPr>
+      <w:r/>
+      <w:r>
+        <w:t>2. The rule — any layer is part of the slice</w:t>
+      </w:r>
+    </w:p>
+    <w:p>
+      <w:r>
+        <w:rPr>
+          <w:b/>
+        </w:rPr>
+        <w:t>A layer is not "done" until it can answer `sample(lat, lon, t)`.</w:t>
+      </w:r>
+      <w:r>
+        <w:t xml:space="preserve"> Every layer in Helm has</w:t>
+      </w:r>
+    </w:p>
+    <w:p>
+      <w:r>
+        <w:rPr>
+          <w:b/>
+        </w:rPr>
+        <w:t>two faces</w:t>
+      </w:r>
+      <w:r>
+        <w:t>:</w:t>
+      </w:r>
+    </w:p>
+    <w:p>
+      <w:pPr>
+        <w:pStyle w:val="ListNumber"/>
+      </w:pPr>
+      <w:r>
+        <w:t xml:space="preserve">a </w:t>
+      </w:r>
+      <w:r>
+        <w:rPr>
+          <w:b/>
+        </w:rPr>
+        <w:t>visual face</w:t>
+      </w:r>
+      <w:r>
+        <w:t xml:space="preserve"> — how it draws on the chart (a MapLibre layer, the S-52 engine, a</w:t>
+      </w:r>
+    </w:p>
+    <w:p>
+      <w:r>
+        <w:t>particle field); and</w:t>
+      </w:r>
+    </w:p>
+    <w:p>
+      <w:pPr>
+        <w:pStyle w:val="ListNumber"/>
+      </w:pPr>
+      <w:r>
+        <w:t xml:space="preserve">a </w:t>
+      </w:r>
+      <w:r>
+        <w:rPr>
+          <w:b/>
+        </w:rPr>
+        <w:t>probe face</w:t>
+      </w:r>
+      <w:r>
+        <w:t xml:space="preserve"> — a uniform contract so it can join the slice and be narrated.</w:t>
+      </w:r>
+    </w:p>
+    <w:p>
+      <w:pPr>
+        <w:shd w:val="clear" w:fill="F2F4F6"/>
+      </w:pPr>
+      <w:r>
+        <w:rPr>
+          <w:rFonts w:ascii="Consolas" w:hAnsi="Consolas"/>
+          <w:color w:val="333333"/>
+          <w:sz w:val="17"/>
+        </w:rPr>
+        <w:t>LayerSample = {</w:t>
+        <w:br/>
+        <w:t xml:space="preserve">  layer:      "wind" | "gust" | "swell" | "depth" | "places" | "reviews" | "saved"</w:t>
+        <w:br/>
+        <w:t xml:space="preserve">            | "climate" | "tide" | "current" | "ais" | "nfl" | "chart" | "route" | …,</w:t>
+        <w:br/>
+        <w:t xml:space="preserve">  value:      &lt;any structured value at the point/time&gt;,   // COMPUTED, never invented</w:t>
+        <w:br/>
+        <w:t xml:space="preserve">  source:     "open" | "owned" | "rag" | "nfl" | "engine",</w:t>
+        <w:br/>
+        <w:t xml:space="preserve">  sourceRef:  { title, url? },</w:t>
+        <w:br/>
+        <w:t xml:space="preserve">  freshness:  ISO timestamp / "climatology" / "live",</w:t>
+        <w:br/>
+        <w:t xml:space="preserve">  confidence: "low" | "fair" | "good",</w:t>
+        <w:br/>
+        <w:t xml:space="preserve">  horizon?:   forecast horizon note (time layers),</w:t>
+        <w:br/>
+        <w:t xml:space="preserve">  locked?:    true if gated (e.g. NFL experimental/partnership)</w:t>
+        <w:br/>
+        <w:t>}</w:t>
+        <w:br/>
+        <w:br/>
+        <w:t>Slice = { point|path|region, samples: LayerSample[], sources[], disclaimer }</w:t>
+      </w:r>
+    </w:p>
+    <w:p>
+      <w:r>
+        <w:t xml:space="preserve">The same toggle that shows/hides a layer on the chart (the </w:t>
+      </w:r>
+      <w:r>
+        <w:rPr>
+          <w:b/>
+        </w:rPr>
+        <w:t>selectable layers</w:t>
+      </w:r>
+      <w:r>
+        <w:t>, like</w:t>
+      </w:r>
+    </w:p>
+    <w:p>
+      <w:r>
+        <w:t xml:space="preserve">weather) doubles as </w:t>
+      </w:r>
+      <w:r>
+        <w:rPr>
+          <w:b/>
+        </w:rPr>
+        <w:t>"include this layer in the slice?"</w:t>
+      </w:r>
+      <w:r>
+        <w:t xml:space="preserve"> — so the user composes both what</w:t>
+      </w:r>
+    </w:p>
+    <w:p>
+      <w:r>
+        <w:t>they see *and* what gets narrated.</w:t>
+      </w:r>
+    </w:p>
+    <w:p>
+      <w:pPr>
+        <w:ind w:left="432"/>
+        <w:pBdr>
+          <w:left w:val="single" w:sz="18" w:space="8" w:color="5BC0FF"/>
+        </w:pBdr>
+      </w:pPr>
+      <w:r>
+        <w:rPr>
+          <w:b/>
+          <w:i/>
+          <w:color w:val="5A6B78"/>
+        </w:rPr>
+        <w:t>Architectural mandate (ADR-0007):</w:t>
+      </w:r>
+      <w:r>
+        <w:rPr>
+          <w:i/>
+          <w:color w:val="5A6B78"/>
+        </w:rPr>
+        <w:t xml:space="preserve"> any new layer — a plugin radar feed, a tide model, a satellite-derived bathymetry tile, a community data source — must implement the probe contract. If it can be drawn, it can be sliced; if it can be sliced, it can be narrated.</w:t>
+      </w:r>
+    </w:p>
+    <w:p>
+      <w:pPr>
+        <w:spacing w:before="40" w:after="40"/>
+        <w:pBdr>
+          <w:bottom w:val="single" w:sz="6" w:space="1" w:color="C8D2DA"/>
+        </w:pBdr>
+      </w:pPr>
+    </w:p>
+    <w:p>
+      <w:pPr>
+        <w:pStyle w:val="Heading2"/>
+      </w:pPr>
+      <w:r/>
+      <w:r>
+        <w:t>3. The layers (current + planned)</w:t>
+      </w:r>
+    </w:p>
+    <w:p>
+      <w:r>
+        <w:t xml:space="preserve">Everything is a layer in the slice. Status is for the </w:t>
+      </w:r>
+      <w:r>
+        <w:rPr>
+          <w:b/>
+        </w:rPr>
+        <w:t>probe face</w:t>
+      </w:r>
+      <w:r>
+        <w:t xml:space="preserve"> (narration), separate</w:t>
+      </w:r>
+    </w:p>
+    <w:p>
+      <w:r>
+        <w:t>from whether it already *draws*.</w:t>
+      </w:r>
+    </w:p>
+    <w:tbl>
+      <w:tblPr>
+        <w:tblStyle w:val="TableGrid"/>
+        <w:tblW w:type="auto" w:w="0"/>
+        <w:jc w:val="center"/>
+        <w:tblLook w:firstColumn="1" w:firstRow="1" w:lastColumn="0" w:lastRow="0" w:noHBand="0" w:noVBand="1" w:val="04A0"/>
+      </w:tblPr>
+      <w:tblGrid>
+        <w:gridCol w:w="2880"/>
+        <w:gridCol w:w="2880"/>
+        <w:gridCol w:w="2880"/>
+      </w:tblGrid>
+      <w:tr>
+        <w:tc>
+          <w:tcPr>
+            <w:tcW w:type="dxa" w:w="2880"/>
+            <w:shd w:val="clear" w:fill="1F6FA8"/>
+          </w:tcPr>
+          <w:p>
+            <w:r>
+              <w:rPr>
+                <w:b/>
+                <w:color w:val="FFFFFF"/>
+                <w:sz w:val="19"/>
+              </w:rPr>
+            </w:r>
+            <w:r>
+              <w:rPr>
+                <w:b/>
+                <w:color w:val="FFFFFF"/>
+                <w:sz w:val="19"/>
+              </w:rPr>
+              <w:t>Layer</w:t>
+            </w:r>
+          </w:p>
+        </w:tc>
+        <w:tc>
+          <w:tcPr>
+            <w:tcW w:type="dxa" w:w="2880"/>
+            <w:shd w:val="clear" w:fill="1F6FA8"/>
+          </w:tcPr>
+          <w:p>
+            <w:r>
+              <w:rPr>
+                <w:b/>
+                <w:color w:val="FFFFFF"/>
+                <w:sz w:val="19"/>
+              </w:rPr>
+            </w:r>
+            <w:r>
+              <w:rPr>
+                <w:b/>
+                <w:color w:val="FFFFFF"/>
+                <w:sz w:val="19"/>
+              </w:rPr>
+              <w:t>Source tier</w:t>
+            </w:r>
+          </w:p>
+        </w:tc>
+        <w:tc>
+          <w:tcPr>
+            <w:tcW w:type="dxa" w:w="2880"/>
+            <w:shd w:val="clear" w:fill="1F6FA8"/>
+          </w:tcPr>
+          <w:p>
+            <w:r>
+              <w:rPr>
+                <w:b/>
+                <w:color w:val="FFFFFF"/>
+                <w:sz w:val="19"/>
+              </w:rPr>
+            </w:r>
+            <w:r>
+              <w:rPr>
+                <w:b/>
+                <w:color w:val="FFFFFF"/>
+                <w:sz w:val="19"/>
+              </w:rPr>
+              <w:t>Probe status</w:t>
+            </w:r>
+          </w:p>
+        </w:tc>
+      </w:tr>
+      <w:tr>
+        <w:tc>
+          <w:tcPr>
+            <w:tcW w:type="dxa" w:w="2880"/>
+          </w:tcPr>
+          <w:p>
+            <w:r>
+              <w:rPr>
+                <w:sz w:val="18"/>
+              </w:rPr>
+            </w:r>
+            <w:r>
+              <w:rPr>
+                <w:sz w:val="18"/>
+              </w:rPr>
+              <w:t>Wind / gust / swell / wave / rain / pressure / current / SST / CAPE</w:t>
+            </w:r>
+          </w:p>
+        </w:tc>
+        <w:tc>
+          <w:tcPr>
+            <w:tcW w:type="dxa" w:w="2880"/>
+          </w:tcPr>
+          <w:p>
+            <w:r>
+              <w:rPr>
+                <w:sz w:val="18"/>
+              </w:rPr>
+            </w:r>
+            <w:r>
+              <w:rPr>
+                <w:sz w:val="18"/>
+              </w:rPr>
+              <w:t>open (GRIB/Open-Meteo)</w:t>
+            </w:r>
+          </w:p>
+        </w:tc>
+        <w:tc>
+          <w:tcPr>
+            <w:tcW w:type="dxa" w:w="2880"/>
+          </w:tcPr>
+          <w:p>
+            <w:r>
+              <w:rPr>
+                <w:sz w:val="18"/>
+              </w:rPr>
+            </w:r>
+            <w:r>
+              <w:rPr>
+                <w:b/>
+                <w:sz w:val="18"/>
+              </w:rPr>
+              <w:t>live</w:t>
+            </w:r>
+            <w:r>
+              <w:rPr>
+                <w:sz w:val="18"/>
+              </w:rPr>
+              <w:t xml:space="preserve"> via </w:t>
+            </w:r>
+            <w:r>
+              <w:rPr>
+                <w:rFonts w:ascii="Consolas" w:hAnsi="Consolas"/>
+                <w:color w:val="9B2C5E"/>
+                <w:sz w:val="18"/>
+              </w:rPr>
+              <w:t>get_weather</w:t>
+            </w:r>
+            <w:r>
+              <w:rPr>
+                <w:sz w:val="18"/>
+              </w:rPr>
+              <w:t xml:space="preserve"> (wind/gust/wave); rest to extend</w:t>
+            </w:r>
+          </w:p>
+        </w:tc>
+      </w:tr>
+      <w:tr>
+        <w:tc>
+          <w:tcPr>
+            <w:tcW w:type="dxa" w:w="2880"/>
+          </w:tcPr>
+          <w:p>
+            <w:r>
+              <w:rPr>
+                <w:sz w:val="18"/>
+              </w:rPr>
+            </w:r>
+            <w:r>
+              <w:rPr>
+                <w:sz w:val="18"/>
+              </w:rPr>
+              <w:t>Climate / tropical-cyclone</w:t>
+            </w:r>
+          </w:p>
+        </w:tc>
+        <w:tc>
+          <w:tcPr>
+            <w:tcW w:type="dxa" w:w="2880"/>
+          </w:tcPr>
+          <w:p>
+            <w:r>
+              <w:rPr>
+                <w:sz w:val="18"/>
+              </w:rPr>
+            </w:r>
+            <w:r>
+              <w:rPr>
+                <w:sz w:val="18"/>
+              </w:rPr>
+              <w:t>open (NOAA/COGOW/NHC/JTWC)</w:t>
+            </w:r>
+          </w:p>
+        </w:tc>
+        <w:tc>
+          <w:tcPr>
+            <w:tcW w:type="dxa" w:w="2880"/>
+          </w:tcPr>
+          <w:p>
+            <w:r>
+              <w:rPr>
+                <w:sz w:val="18"/>
+              </w:rPr>
+            </w:r>
+            <w:r>
+              <w:rPr>
+                <w:b/>
+                <w:sz w:val="18"/>
+              </w:rPr>
+              <w:t>stub</w:t>
+            </w:r>
+            <w:r>
+              <w:rPr>
+                <w:sz w:val="18"/>
+              </w:rPr>
+              <w:t xml:space="preserve"> → real climatology tier (</w:t>
+            </w:r>
+            <w:r>
+              <w:rPr>
+                <w:color w:val="1F6FA8"/>
+                <w:sz w:val="18"/>
+                <w:u w:val="single"/>
+              </w:rPr>
+              <w:t>WEATHER-ROUTING §5</w:t>
+            </w:r>
+            <w:r>
+              <w:rPr>
+                <w:sz w:val="18"/>
+              </w:rPr>
+              <w:t>)</w:t>
+            </w:r>
+          </w:p>
+        </w:tc>
+      </w:tr>
+      <w:tr>
+        <w:tc>
+          <w:tcPr>
+            <w:tcW w:type="dxa" w:w="2880"/>
+          </w:tcPr>
+          <w:p>
+            <w:r>
+              <w:rPr>
+                <w:sz w:val="18"/>
+              </w:rPr>
+            </w:r>
+            <w:r>
+              <w:rPr>
+                <w:sz w:val="18"/>
+              </w:rPr>
+              <w:t>Depth / chart (S-52)</w:t>
+            </w:r>
+          </w:p>
+        </w:tc>
+        <w:tc>
+          <w:tcPr>
+            <w:tcW w:type="dxa" w:w="2880"/>
+          </w:tcPr>
+          <w:p>
+            <w:r>
+              <w:rPr>
+                <w:sz w:val="18"/>
+              </w:rPr>
+            </w:r>
+            <w:r>
+              <w:rPr>
+                <w:sz w:val="18"/>
+              </w:rPr>
+              <w:t>open (NOAA ENC)</w:t>
+            </w:r>
+          </w:p>
+        </w:tc>
+        <w:tc>
+          <w:tcPr>
+            <w:tcW w:type="dxa" w:w="2880"/>
+          </w:tcPr>
+          <w:p>
+            <w:r>
+              <w:rPr>
+                <w:sz w:val="18"/>
+              </w:rPr>
+            </w:r>
+            <w:r>
+              <w:rPr>
+                <w:sz w:val="18"/>
+              </w:rPr>
+              <w:t xml:space="preserve">pointer now ("see chart"); </w:t>
+            </w:r>
+            <w:r>
+              <w:rPr>
+                <w:b/>
+                <w:sz w:val="18"/>
+              </w:rPr>
+              <w:t>TODO</w:t>
+            </w:r>
+            <w:r>
+              <w:rPr>
+                <w:sz w:val="18"/>
+              </w:rPr>
+              <w:t xml:space="preserve"> depth-at-point from the engine</w:t>
+            </w:r>
+          </w:p>
+        </w:tc>
+      </w:tr>
+      <w:tr>
+        <w:tc>
+          <w:tcPr>
+            <w:tcW w:type="dxa" w:w="2880"/>
+          </w:tcPr>
+          <w:p>
+            <w:r>
+              <w:rPr>
+                <w:sz w:val="18"/>
+              </w:rPr>
+            </w:r>
+            <w:r>
+              <w:rPr>
+                <w:sz w:val="18"/>
+              </w:rPr>
+              <w:t>Tides &amp; currents</w:t>
+            </w:r>
+          </w:p>
+        </w:tc>
+        <w:tc>
+          <w:tcPr>
+            <w:tcW w:type="dxa" w:w="2880"/>
+          </w:tcPr>
+          <w:p>
+            <w:r>
+              <w:rPr>
+                <w:sz w:val="18"/>
+              </w:rPr>
+            </w:r>
+            <w:r>
+              <w:rPr>
+                <w:sz w:val="18"/>
+              </w:rPr>
+              <w:t>open (harmonics)</w:t>
+            </w:r>
+          </w:p>
+        </w:tc>
+        <w:tc>
+          <w:tcPr>
+            <w:tcW w:type="dxa" w:w="2880"/>
+          </w:tcPr>
+          <w:p>
+            <w:r>
+              <w:rPr>
+                <w:sz w:val="18"/>
+              </w:rPr>
+            </w:r>
+            <w:r>
+              <w:rPr>
+                <w:b/>
+                <w:sz w:val="18"/>
+              </w:rPr>
+              <w:t>TODO</w:t>
+            </w:r>
+          </w:p>
+        </w:tc>
+      </w:tr>
+      <w:tr>
+        <w:tc>
+          <w:tcPr>
+            <w:tcW w:type="dxa" w:w="2880"/>
+          </w:tcPr>
+          <w:p>
+            <w:r>
+              <w:rPr>
+                <w:sz w:val="18"/>
+              </w:rPr>
+            </w:r>
+            <w:r>
+              <w:rPr>
+                <w:sz w:val="18"/>
+              </w:rPr>
+              <w:t>Places (marinas/anchorages/fuel/services)</w:t>
+            </w:r>
+          </w:p>
+        </w:tc>
+        <w:tc>
+          <w:tcPr>
+            <w:tcW w:type="dxa" w:w="2880"/>
+          </w:tcPr>
+          <w:p>
+            <w:r>
+              <w:rPr>
+                <w:sz w:val="18"/>
+              </w:rPr>
+            </w:r>
+            <w:r>
+              <w:rPr>
+                <w:sz w:val="18"/>
+              </w:rPr>
+              <w:t>open (OSM/OpenSeaMap)</w:t>
+            </w:r>
+          </w:p>
+        </w:tc>
+        <w:tc>
+          <w:tcPr>
+            <w:tcW w:type="dxa" w:w="2880"/>
+          </w:tcPr>
+          <w:p>
+            <w:r>
+              <w:rPr>
+                <w:sz w:val="18"/>
+              </w:rPr>
+            </w:r>
+            <w:r>
+              <w:rPr>
+                <w:b/>
+                <w:sz w:val="18"/>
+              </w:rPr>
+              <w:t>live</w:t>
+            </w:r>
+            <w:r>
+              <w:rPr>
+                <w:sz w:val="18"/>
+              </w:rPr>
+              <w:t xml:space="preserve"> via the place store</w:t>
+            </w:r>
+          </w:p>
+        </w:tc>
+      </w:tr>
+      <w:tr>
+        <w:tc>
+          <w:tcPr>
+            <w:tcW w:type="dxa" w:w="2880"/>
+          </w:tcPr>
+          <w:p>
+            <w:r>
+              <w:rPr>
+                <w:sz w:val="18"/>
+              </w:rPr>
+            </w:r>
+            <w:r>
+              <w:rPr>
+                <w:sz w:val="18"/>
+              </w:rPr>
+              <w:t>Reviews</w:t>
+            </w:r>
+          </w:p>
+        </w:tc>
+        <w:tc>
+          <w:tcPr>
+            <w:tcW w:type="dxa" w:w="2880"/>
+          </w:tcPr>
+          <w:p>
+            <w:r>
+              <w:rPr>
+                <w:sz w:val="18"/>
+              </w:rPr>
+            </w:r>
+            <w:r>
+              <w:rPr>
+                <w:sz w:val="18"/>
+              </w:rPr>
+              <w:t>owned + rag</w:t>
+            </w:r>
+          </w:p>
+        </w:tc>
+        <w:tc>
+          <w:tcPr>
+            <w:tcW w:type="dxa" w:w="2880"/>
+          </w:tcPr>
+          <w:p>
+            <w:r>
+              <w:rPr>
+                <w:sz w:val="18"/>
+              </w:rPr>
+            </w:r>
+            <w:r>
+              <w:rPr>
+                <w:b/>
+                <w:sz w:val="18"/>
+              </w:rPr>
+              <w:t>live</w:t>
+            </w:r>
+            <w:r>
+              <w:rPr>
+                <w:sz w:val="18"/>
+              </w:rPr>
+              <w:t xml:space="preserve"> (owned) + cited RAG</w:t>
+            </w:r>
+          </w:p>
+        </w:tc>
+      </w:tr>
+      <w:tr>
+        <w:tc>
+          <w:tcPr>
+            <w:tcW w:type="dxa" w:w="2880"/>
+          </w:tcPr>
+          <w:p>
+            <w:r>
+              <w:rPr>
+                <w:sz w:val="18"/>
+              </w:rPr>
+            </w:r>
+            <w:r>
+              <w:rPr>
+                <w:sz w:val="18"/>
+              </w:rPr>
+              <w:t>Saved places (your pins)</w:t>
+            </w:r>
+          </w:p>
+        </w:tc>
+        <w:tc>
+          <w:tcPr>
+            <w:tcW w:type="dxa" w:w="2880"/>
+          </w:tcPr>
+          <w:p>
+            <w:r>
+              <w:rPr>
+                <w:sz w:val="18"/>
+              </w:rPr>
+            </w:r>
+            <w:r>
+              <w:rPr>
+                <w:sz w:val="18"/>
+              </w:rPr>
+              <w:t>owned</w:t>
+            </w:r>
+          </w:p>
+        </w:tc>
+        <w:tc>
+          <w:tcPr>
+            <w:tcW w:type="dxa" w:w="2880"/>
+          </w:tcPr>
+          <w:p>
+            <w:r>
+              <w:rPr>
+                <w:sz w:val="18"/>
+              </w:rPr>
+            </w:r>
+            <w:r>
+              <w:rPr>
+                <w:b/>
+                <w:sz w:val="18"/>
+              </w:rPr>
+              <w:t>live</w:t>
+            </w:r>
+          </w:p>
+        </w:tc>
+      </w:tr>
+      <w:tr>
+        <w:tc>
+          <w:tcPr>
+            <w:tcW w:type="dxa" w:w="2880"/>
+          </w:tcPr>
+          <w:p>
+            <w:r>
+              <w:rPr>
+                <w:sz w:val="18"/>
+              </w:rPr>
+            </w:r>
+            <w:r>
+              <w:rPr>
+                <w:sz w:val="18"/>
+              </w:rPr>
+              <w:t>AIS targets</w:t>
+            </w:r>
+          </w:p>
+        </w:tc>
+        <w:tc>
+          <w:tcPr>
+            <w:tcW w:type="dxa" w:w="2880"/>
+          </w:tcPr>
+          <w:p>
+            <w:r>
+              <w:rPr>
+                <w:sz w:val="18"/>
+              </w:rPr>
+            </w:r>
+            <w:r>
+              <w:rPr>
+                <w:sz w:val="18"/>
+              </w:rPr>
+              <w:t>engine</w:t>
+            </w:r>
+          </w:p>
+        </w:tc>
+        <w:tc>
+          <w:tcPr>
+            <w:tcW w:type="dxa" w:w="2880"/>
+          </w:tcPr>
+          <w:p>
+            <w:r>
+              <w:rPr>
+                <w:sz w:val="18"/>
+              </w:rPr>
+            </w:r>
+            <w:r>
+              <w:rPr>
+                <w:b/>
+                <w:sz w:val="18"/>
+              </w:rPr>
+              <w:t>TODO</w:t>
+            </w:r>
+            <w:r>
+              <w:rPr>
+                <w:sz w:val="18"/>
+              </w:rPr>
+              <w:t xml:space="preserve"> (CPA/TCPA already computed in the engine)</w:t>
+            </w:r>
+          </w:p>
+        </w:tc>
+      </w:tr>
+      <w:tr>
+        <w:tc>
+          <w:tcPr>
+            <w:tcW w:type="dxa" w:w="2880"/>
+          </w:tcPr>
+          <w:p>
+            <w:r>
+              <w:rPr>
+                <w:sz w:val="18"/>
+              </w:rPr>
+            </w:r>
+            <w:r>
+              <w:rPr>
+                <w:sz w:val="18"/>
+              </w:rPr>
+              <w:t>Route / route-weather</w:t>
+            </w:r>
+          </w:p>
+        </w:tc>
+        <w:tc>
+          <w:tcPr>
+            <w:tcW w:type="dxa" w:w="2880"/>
+          </w:tcPr>
+          <w:p>
+            <w:r>
+              <w:rPr>
+                <w:sz w:val="18"/>
+              </w:rPr>
+            </w:r>
+            <w:r>
+              <w:rPr>
+                <w:sz w:val="18"/>
+              </w:rPr>
+              <w:t>engine + weather</w:t>
+            </w:r>
+          </w:p>
+        </w:tc>
+        <w:tc>
+          <w:tcPr>
+            <w:tcW w:type="dxa" w:w="2880"/>
+          </w:tcPr>
+          <w:p>
+            <w:r>
+              <w:rPr>
+                <w:sz w:val="18"/>
+              </w:rPr>
+            </w:r>
+            <w:r>
+              <w:rPr>
+                <w:b/>
+                <w:sz w:val="18"/>
+              </w:rPr>
+              <w:t>TODO</w:t>
+            </w:r>
+            <w:r>
+              <w:rPr>
+                <w:sz w:val="18"/>
+              </w:rPr>
+              <w:t xml:space="preserve"> (couple </w:t>
+            </w:r>
+            <w:r>
+              <w:rPr>
+                <w:rFonts w:ascii="Consolas" w:hAnsi="Consolas"/>
+                <w:color w:val="9B2C5E"/>
+                <w:sz w:val="18"/>
+              </w:rPr>
+              <w:t>W(P(t),t)</w:t>
+            </w:r>
+            <w:r>
+              <w:rPr>
+                <w:sz w:val="18"/>
+              </w:rPr>
+              <w:t>)</w:t>
+            </w:r>
+          </w:p>
+        </w:tc>
+      </w:tr>
+      <w:tr>
+        <w:tc>
+          <w:tcPr>
+            <w:tcW w:type="dxa" w:w="2880"/>
+          </w:tcPr>
+          <w:p>
+            <w:r>
+              <w:rPr>
+                <w:sz w:val="18"/>
+              </w:rPr>
+            </w:r>
+            <w:r>
+              <w:rPr>
+                <w:sz w:val="18"/>
+              </w:rPr>
+              <w:t>Satellite imagery</w:t>
+            </w:r>
+          </w:p>
+        </w:tc>
+        <w:tc>
+          <w:tcPr>
+            <w:tcW w:type="dxa" w:w="2880"/>
+          </w:tcPr>
+          <w:p>
+            <w:r>
+              <w:rPr>
+                <w:sz w:val="18"/>
+              </w:rPr>
+            </w:r>
+            <w:r>
+              <w:rPr>
+                <w:sz w:val="18"/>
+              </w:rPr>
+              <w:t>open (Sentinel-2) / BYO</w:t>
+            </w:r>
+          </w:p>
+        </w:tc>
+        <w:tc>
+          <w:tcPr>
+            <w:tcW w:type="dxa" w:w="2880"/>
+          </w:tcPr>
+          <w:p>
+            <w:r>
+              <w:rPr>
+                <w:sz w:val="18"/>
+              </w:rPr>
+            </w:r>
+            <w:r>
+              <w:rPr>
+                <w:sz w:val="18"/>
+              </w:rPr>
+              <w:t>visual only; supplemental</w:t>
+            </w:r>
+          </w:p>
+        </w:tc>
+      </w:tr>
+      <w:tr>
+        <w:tc>
+          <w:tcPr>
+            <w:tcW w:type="dxa" w:w="2880"/>
+          </w:tcPr>
+          <w:p>
+            <w:r>
+              <w:rPr>
+                <w:sz w:val="18"/>
+              </w:rPr>
+            </w:r>
+            <w:r>
+              <w:rPr>
+                <w:b/>
+                <w:sz w:val="18"/>
+              </w:rPr>
+              <w:t>NoForeignLand</w:t>
+            </w:r>
+          </w:p>
+        </w:tc>
+        <w:tc>
+          <w:tcPr>
+            <w:tcW w:type="dxa" w:w="2880"/>
+          </w:tcPr>
+          <w:p>
+            <w:r>
+              <w:rPr>
+                <w:sz w:val="18"/>
+              </w:rPr>
+            </w:r>
+            <w:r>
+              <w:rPr>
+                <w:sz w:val="18"/>
+              </w:rPr>
+              <w:t>walled</w:t>
+            </w:r>
+          </w:p>
+        </w:tc>
+        <w:tc>
+          <w:tcPr>
+            <w:tcW w:type="dxa" w:w="2880"/>
+          </w:tcPr>
+          <w:p>
+            <w:r>
+              <w:rPr>
+                <w:sz w:val="18"/>
+              </w:rPr>
+            </w:r>
+            <w:r>
+              <w:rPr>
+                <w:b/>
+                <w:sz w:val="18"/>
+              </w:rPr>
+              <w:t>locked</w:t>
+            </w:r>
+            <w:r>
+              <w:rPr>
+                <w:sz w:val="18"/>
+              </w:rPr>
+              <w:t xml:space="preserve"> slot — experimental/partnership only (</w:t>
+            </w:r>
+            <w:r>
+              <w:rPr>
+                <w:color w:val="1F6FA8"/>
+                <w:sz w:val="18"/>
+                <w:u w:val="single"/>
+              </w:rPr>
+              <w:t>ADR-0005</w:t>
+            </w:r>
+            <w:r>
+              <w:rPr>
+                <w:sz w:val="18"/>
+              </w:rPr>
+              <w:t>)</w:t>
+            </w:r>
+          </w:p>
+        </w:tc>
+      </w:tr>
+    </w:tbl>
+    <w:p/>
+    <w:p>
+      <w:pPr>
+        <w:spacing w:before="40" w:after="40"/>
+        <w:pBdr>
+          <w:bottom w:val="single" w:sz="6" w:space="1" w:color="C8D2DA"/>
+        </w:pBdr>
+      </w:pPr>
+    </w:p>
+    <w:p>
+      <w:pPr>
+        <w:pStyle w:val="Heading2"/>
+      </w:pPr>
+      <w:r/>
+      <w:r>
+        <w:t>4. Query modes (one primitive, several shapes)</w:t>
+      </w:r>
+    </w:p>
+    <w:p>
+      <w:pPr>
+        <w:pStyle w:val="ListBullet"/>
+      </w:pPr>
+      <w:r>
+        <w:rPr>
+          <w:b/>
+        </w:rPr>
+        <w:t>Point</w:t>
+      </w:r>
+      <w:r>
+        <w:t xml:space="preserve"> — tap the chart → slice at </w:t>
       </w:r>
       <w:r>
         <w:rPr>
@@ -5949,6 +7147,1170 @@
           <w:color w:val="9B2C5E"/>
           <w:sz w:val="19"/>
         </w:rPr>
+        <w:t>(lat, lon, now)</w:t>
+      </w:r>
+      <w:r>
+        <w:t xml:space="preserve"> → narrate "what's here, now."</w:t>
+      </w:r>
+    </w:p>
+    <w:p>
+      <w:pPr>
+        <w:pStyle w:val="ListBullet"/>
+      </w:pPr>
+      <w:r>
+        <w:rPr>
+          <w:b/>
+        </w:rPr>
+        <w:t>Point + time</w:t>
+      </w:r>
+      <w:r>
+        <w:t xml:space="preserve"> — tap + scrub the timeline → slice at </w:t>
+      </w:r>
+      <w:r>
+        <w:rPr>
+          <w:rFonts w:ascii="Consolas" w:hAnsi="Consolas"/>
+          <w:color w:val="9B2C5E"/>
+          <w:sz w:val="19"/>
+        </w:rPr>
+        <w:t>(lat, lon, t)</w:t>
+      </w:r>
+      <w:r>
+        <w:t xml:space="preserve"> → "what it'll be like</w:t>
+      </w:r>
+    </w:p>
+    <w:p>
+      <w:r>
+        <w:t>here, then."</w:t>
+      </w:r>
+    </w:p>
+    <w:p>
+      <w:pPr>
+        <w:pStyle w:val="ListBullet"/>
+      </w:pPr>
+      <w:r>
+        <w:rPr>
+          <w:b/>
+        </w:rPr>
+        <w:t>Path `P(t)`</w:t>
+      </w:r>
+      <w:r>
+        <w:t xml:space="preserve"> — your route → a *sequence* of slices along the worldline → the passage</w:t>
+      </w:r>
+    </w:p>
+    <w:p>
+      <w:r>
+        <w:t>briefing (</w:t>
+      </w:r>
+      <w:r>
+        <w:rPr>
+          <w:color w:val="1F6FA8"/>
+          <w:u w:val="single"/>
+        </w:rPr>
+        <w:t>WEATHER-ROUTING §2</w:t>
+      </w:r>
+      <w:r>
+        <w:t>) and the route-weather ribbon.</w:t>
+      </w:r>
+    </w:p>
+    <w:p>
+      <w:pPr>
+        <w:pStyle w:val="ListBullet"/>
+      </w:pPr>
+      <w:r>
+        <w:rPr>
+          <w:b/>
+        </w:rPr>
+        <w:t>Destination</w:t>
+      </w:r>
+      <w:r>
+        <w:t xml:space="preserve"> — a place + your ETA → the slice that fills the dossier (</w:t>
+      </w:r>
+      <w:r>
+        <w:rPr>
+          <w:color w:val="1F6FA8"/>
+          <w:u w:val="single"/>
+        </w:rPr>
+        <w:t>BRIEFINGS.md</w:t>
+      </w:r>
+      <w:r>
+        <w:t>).</w:t>
+      </w:r>
+    </w:p>
+    <w:p>
+      <w:pPr>
+        <w:pStyle w:val="ListBullet"/>
+      </w:pPr>
+      <w:r>
+        <w:rPr>
+          <w:b/>
+        </w:rPr>
+        <w:t>Region</w:t>
+      </w:r>
+      <w:r>
+        <w:t xml:space="preserve"> — a bbox + time → "what's notable in this area" (where-to-go candidates).</w:t>
+      </w:r>
+    </w:p>
+    <w:p>
+      <w:r>
+        <w:t xml:space="preserve">All four are the </w:t>
+      </w:r>
+      <w:r>
+        <w:rPr>
+          <w:b/>
+        </w:rPr>
+        <w:t>same</w:t>
+      </w:r>
+      <w:r>
+        <w:t xml:space="preserve"> resolve→narrate pipeline at different geometries. The destination</w:t>
+      </w:r>
+    </w:p>
+    <w:p>
+      <w:r>
+        <w:t>dossier and the passage briefing are not separate engines — they are the spacetime probe</w:t>
+      </w:r>
+    </w:p>
+    <w:p>
+      <w:r>
+        <w:t>applied to a place and to a path.</w:t>
+      </w:r>
+    </w:p>
+    <w:p>
+      <w:pPr>
+        <w:spacing w:before="40" w:after="40"/>
+        <w:pBdr>
+          <w:bottom w:val="single" w:sz="6" w:space="1" w:color="C8D2DA"/>
+        </w:pBdr>
+      </w:pPr>
+    </w:p>
+    <w:p>
+      <w:pPr>
+        <w:pStyle w:val="Heading2"/>
+      </w:pPr>
+      <w:r/>
+      <w:r>
+        <w:t>5. The narrator</w:t>
+      </w:r>
+    </w:p>
+    <w:p>
+      <w:r>
+        <w:t>The ReAct agent (</w:t>
+      </w:r>
+      <w:r>
+        <w:rPr>
+          <w:color w:val="1F6FA8"/>
+          <w:u w:val="single"/>
+        </w:rPr>
+        <w:t>agents.py</w:t>
+      </w:r>
+      <w:r>
+        <w:t xml:space="preserve"> </w:t>
+      </w:r>
+      <w:r>
+        <w:rPr>
+          <w:rFonts w:ascii="Consolas" w:hAnsi="Consolas"/>
+          <w:color w:val="9B2C5E"/>
+          <w:sz w:val="19"/>
+        </w:rPr>
+        <w:t>narrate_context</w:t>
+      </w:r>
+      <w:r>
+        <w:t>) turns a slice into</w:t>
+      </w:r>
+    </w:p>
+    <w:p>
+      <w:r>
+        <w:t>2–4 plain sentences:</w:t>
+      </w:r>
+    </w:p>
+    <w:p>
+      <w:pPr>
+        <w:ind w:left="432"/>
+        <w:pBdr>
+          <w:left w:val="single" w:sz="18" w:space="8" w:color="5BC0FF"/>
+        </w:pBdr>
+      </w:pPr>
+      <w:r>
+        <w:rPr>
+          <w:i/>
+          <w:color w:val="5A6B78"/>
+        </w:rPr>
+        <w:t>*"At 24.55°N 81.80°W, Thu 20:00: wind ~22 kt from the NE gusting 28, seas ~1.4 m. Nearest: Garrison Bight (0.7 NM) — 'held well in a 25 kt norther' (SV Halcyon). Late dry season, low cyclone risk. NoForeignLand data: locked (experimental). Cross-reference the S-52 chart for depth. Verify on official charts."*</w:t>
+      </w:r>
+    </w:p>
+    <w:p>
+      <w:r>
+        <w:rPr>
+          <w:b/>
+        </w:rPr>
+        <w:t>Honesty is structural, not cosmetic:</w:t>
+      </w:r>
+    </w:p>
+    <w:p>
+      <w:pPr>
+        <w:pStyle w:val="ListBullet"/>
+      </w:pPr>
+      <w:r>
+        <w:t xml:space="preserve">The agent may only narrate the </w:t>
+      </w:r>
+      <w:r>
+        <w:rPr>
+          <w:b/>
+        </w:rPr>
+        <w:t>values the layers returned</w:t>
+      </w:r>
+      <w:r>
+        <w:t xml:space="preserve"> — never invent a fee, depth,</w:t>
+      </w:r>
+    </w:p>
+    <w:p>
+      <w:r>
+        <w:t>holding, or forecast; gaps are "verify locally."</w:t>
+      </w:r>
+    </w:p>
+    <w:p>
+      <w:pPr>
+        <w:pStyle w:val="ListBullet"/>
+      </w:pPr>
+      <w:r>
+        <w:t xml:space="preserve">Each clause traces to a </w:t>
+      </w:r>
+      <w:r>
+        <w:rPr>
+          <w:rFonts w:ascii="Consolas" w:hAnsi="Consolas"/>
+          <w:color w:val="9B2C5E"/>
+          <w:sz w:val="19"/>
+        </w:rPr>
+        <w:t>source</w:t>
+      </w:r>
+      <w:r>
+        <w:t xml:space="preserve"> + </w:t>
+      </w:r>
+      <w:r>
+        <w:rPr>
+          <w:rFonts w:ascii="Consolas" w:hAnsi="Consolas"/>
+          <w:color w:val="9B2C5E"/>
+          <w:sz w:val="19"/>
+        </w:rPr>
+        <w:t>freshness</w:t>
+      </w:r>
+      <w:r>
+        <w:t xml:space="preserve">; time layers carry a </w:t>
+      </w:r>
+      <w:r>
+        <w:rPr>
+          <w:b/>
+        </w:rPr>
+        <w:t>horizon/confidence</w:t>
+      </w:r>
+      <w:r>
+        <w:t>.</w:t>
+      </w:r>
+    </w:p>
+    <w:p>
+      <w:pPr>
+        <w:pStyle w:val="ListBullet"/>
+      </w:pPr>
+      <w:r>
+        <w:rPr>
+          <w:b/>
+        </w:rPr>
+        <w:t>Walled layers stay locked</w:t>
+      </w:r>
+      <w:r>
+        <w:t xml:space="preserve"> (NFL) and are *named as locked*, never silently dropped or</w:t>
+      </w:r>
+    </w:p>
+    <w:p>
+      <w:r>
+        <w:t>faked.</w:t>
+      </w:r>
+    </w:p>
+    <w:p>
+      <w:pPr>
+        <w:pStyle w:val="ListBullet"/>
+      </w:pPr>
+      <w:r>
+        <w:t xml:space="preserve">Satellite/SDB layers are </w:t>
+      </w:r>
+      <w:r>
+        <w:rPr>
+          <w:b/>
+        </w:rPr>
+        <w:t>supplemental</w:t>
+      </w:r>
+      <w:r>
+        <w:t xml:space="preserve"> — the narration says so.</w:t>
+      </w:r>
+    </w:p>
+    <w:p>
+      <w:pPr>
+        <w:pStyle w:val="ListBullet"/>
+      </w:pPr>
+      <w:r>
+        <w:t>Deterministic core, agent on top: the numbers are computed; the agent sequences and speaks</w:t>
+      </w:r>
+    </w:p>
+    <w:p>
+      <w:r>
+        <w:t>them.</w:t>
+      </w:r>
+    </w:p>
+    <w:p>
+      <w:pPr>
+        <w:spacing w:before="40" w:after="40"/>
+        <w:pBdr>
+          <w:bottom w:val="single" w:sz="6" w:space="1" w:color="C8D2DA"/>
+        </w:pBdr>
+      </w:pPr>
+    </w:p>
+    <w:p>
+      <w:pPr>
+        <w:pStyle w:val="Heading2"/>
+      </w:pPr>
+      <w:r/>
+      <w:r>
+        <w:t>6. Mapping to code (today)</w:t>
+      </w:r>
+    </w:p>
+    <w:tbl>
+      <w:tblPr>
+        <w:tblStyle w:val="TableGrid"/>
+        <w:tblW w:type="auto" w:w="0"/>
+        <w:jc w:val="center"/>
+        <w:tblLook w:firstColumn="1" w:firstRow="1" w:lastColumn="0" w:lastRow="0" w:noHBand="0" w:noVBand="1" w:val="04A0"/>
+      </w:tblPr>
+      <w:tblGrid>
+        <w:gridCol w:w="4320"/>
+        <w:gridCol w:w="4320"/>
+      </w:tblGrid>
+      <w:tr>
+        <w:tc>
+          <w:tcPr>
+            <w:tcW w:type="dxa" w:w="4320"/>
+            <w:shd w:val="clear" w:fill="1F6FA8"/>
+          </w:tcPr>
+          <w:p>
+            <w:r>
+              <w:rPr>
+                <w:b/>
+                <w:color w:val="FFFFFF"/>
+                <w:sz w:val="19"/>
+              </w:rPr>
+            </w:r>
+            <w:r>
+              <w:rPr>
+                <w:b/>
+                <w:color w:val="FFFFFF"/>
+                <w:sz w:val="19"/>
+              </w:rPr>
+              <w:t>Concept</w:t>
+            </w:r>
+          </w:p>
+        </w:tc>
+        <w:tc>
+          <w:tcPr>
+            <w:tcW w:type="dxa" w:w="4320"/>
+            <w:shd w:val="clear" w:fill="1F6FA8"/>
+          </w:tcPr>
+          <w:p>
+            <w:r>
+              <w:rPr>
+                <w:b/>
+                <w:color w:val="FFFFFF"/>
+                <w:sz w:val="19"/>
+              </w:rPr>
+            </w:r>
+            <w:r>
+              <w:rPr>
+                <w:b/>
+                <w:color w:val="FFFFFF"/>
+                <w:sz w:val="19"/>
+              </w:rPr>
+              <w:t>Code</w:t>
+            </w:r>
+          </w:p>
+        </w:tc>
+      </w:tr>
+      <w:tr>
+        <w:tc>
+          <w:tcPr>
+            <w:tcW w:type="dxa" w:w="4320"/>
+          </w:tcPr>
+          <w:p>
+            <w:r>
+              <w:rPr>
+                <w:sz w:val="18"/>
+              </w:rPr>
+            </w:r>
+            <w:r>
+              <w:rPr>
+                <w:sz w:val="18"/>
+              </w:rPr>
+              <w:t>Slice resolver</w:t>
+            </w:r>
+          </w:p>
+        </w:tc>
+        <w:tc>
+          <w:tcPr>
+            <w:tcW w:type="dxa" w:w="4320"/>
+          </w:tcPr>
+          <w:p>
+            <w:r>
+              <w:rPr>
+                <w:sz w:val="18"/>
+              </w:rPr>
+            </w:r>
+            <w:r>
+              <w:rPr>
+                <w:color w:val="1F6FA8"/>
+                <w:sz w:val="18"/>
+                <w:u w:val="single"/>
+              </w:rPr>
+              <w:t>`backend/context.py`</w:t>
+            </w:r>
+            <w:r>
+              <w:rPr>
+                <w:sz w:val="18"/>
+              </w:rPr>
+              <w:t xml:space="preserve"> </w:t>
+            </w:r>
+            <w:r>
+              <w:rPr>
+                <w:rFonts w:ascii="Consolas" w:hAnsi="Consolas"/>
+                <w:color w:val="9B2C5E"/>
+                <w:sz w:val="18"/>
+              </w:rPr>
+              <w:t>resolve_context(lat, lon, t, …)</w:t>
+            </w:r>
+          </w:p>
+        </w:tc>
+      </w:tr>
+      <w:tr>
+        <w:tc>
+          <w:tcPr>
+            <w:tcW w:type="dxa" w:w="4320"/>
+          </w:tcPr>
+          <w:p>
+            <w:r>
+              <w:rPr>
+                <w:sz w:val="18"/>
+              </w:rPr>
+            </w:r>
+            <w:r>
+              <w:rPr>
+                <w:sz w:val="18"/>
+              </w:rPr>
+              <w:t>Narrator</w:t>
+            </w:r>
+          </w:p>
+        </w:tc>
+        <w:tc>
+          <w:tcPr>
+            <w:tcW w:type="dxa" w:w="4320"/>
+          </w:tcPr>
+          <w:p>
+            <w:r>
+              <w:rPr>
+                <w:sz w:val="18"/>
+              </w:rPr>
+            </w:r>
+            <w:r>
+              <w:rPr>
+                <w:color w:val="1F6FA8"/>
+                <w:sz w:val="18"/>
+                <w:u w:val="single"/>
+              </w:rPr>
+              <w:t>`backend/agents.py`</w:t>
+            </w:r>
+            <w:r>
+              <w:rPr>
+                <w:sz w:val="18"/>
+              </w:rPr>
+              <w:t xml:space="preserve"> </w:t>
+            </w:r>
+            <w:r>
+              <w:rPr>
+                <w:rFonts w:ascii="Consolas" w:hAnsi="Consolas"/>
+                <w:color w:val="9B2C5E"/>
+                <w:sz w:val="18"/>
+              </w:rPr>
+              <w:t>ResearchAgent.narrate_context</w:t>
+            </w:r>
+          </w:p>
+        </w:tc>
+      </w:tr>
+      <w:tr>
+        <w:tc>
+          <w:tcPr>
+            <w:tcW w:type="dxa" w:w="4320"/>
+          </w:tcPr>
+          <w:p>
+            <w:r>
+              <w:rPr>
+                <w:sz w:val="18"/>
+              </w:rPr>
+            </w:r>
+            <w:r>
+              <w:rPr>
+                <w:sz w:val="18"/>
+              </w:rPr>
+              <w:t>Endpoints</w:t>
+            </w:r>
+          </w:p>
+        </w:tc>
+        <w:tc>
+          <w:tcPr>
+            <w:tcW w:type="dxa" w:w="4320"/>
+          </w:tcPr>
+          <w:p>
+            <w:r>
+              <w:rPr>
+                <w:sz w:val="18"/>
+              </w:rPr>
+            </w:r>
+            <w:r>
+              <w:rPr>
+                <w:rFonts w:ascii="Consolas" w:hAnsi="Consolas"/>
+                <w:color w:val="9B2C5E"/>
+                <w:sz w:val="18"/>
+              </w:rPr>
+              <w:t>POST /context</w:t>
+            </w:r>
+            <w:r>
+              <w:rPr>
+                <w:sz w:val="18"/>
+              </w:rPr>
+              <w:t xml:space="preserve"> (the fused slice) · </w:t>
+            </w:r>
+            <w:r>
+              <w:rPr>
+                <w:rFonts w:ascii="Consolas" w:hAnsi="Consolas"/>
+                <w:color w:val="9B2C5E"/>
+                <w:sz w:val="18"/>
+              </w:rPr>
+              <w:t>POST /narrate</w:t>
+            </w:r>
+            <w:r>
+              <w:rPr>
+                <w:sz w:val="18"/>
+              </w:rPr>
+              <w:t xml:space="preserve"> (the narration)</w:t>
+            </w:r>
+          </w:p>
+        </w:tc>
+      </w:tr>
+      <w:tr>
+        <w:tc>
+          <w:tcPr>
+            <w:tcW w:type="dxa" w:w="4320"/>
+          </w:tcPr>
+          <w:p>
+            <w:r>
+              <w:rPr>
+                <w:sz w:val="18"/>
+              </w:rPr>
+            </w:r>
+            <w:r>
+              <w:rPr>
+                <w:sz w:val="18"/>
+              </w:rPr>
+              <w:t>Weather probe</w:t>
+            </w:r>
+          </w:p>
+        </w:tc>
+        <w:tc>
+          <w:tcPr>
+            <w:tcW w:type="dxa" w:w="4320"/>
+          </w:tcPr>
+          <w:p>
+            <w:r>
+              <w:rPr>
+                <w:sz w:val="18"/>
+              </w:rPr>
+            </w:r>
+            <w:r>
+              <w:rPr>
+                <w:rFonts w:ascii="Consolas" w:hAnsi="Consolas"/>
+                <w:color w:val="9B2C5E"/>
+                <w:sz w:val="18"/>
+              </w:rPr>
+              <w:t>agents.get_weather</w:t>
+            </w:r>
+            <w:r>
+              <w:rPr>
+                <w:sz w:val="18"/>
+              </w:rPr>
+              <w:t xml:space="preserve"> (Open-Meteo, live)</w:t>
+            </w:r>
+          </w:p>
+        </w:tc>
+      </w:tr>
+      <w:tr>
+        <w:tc>
+          <w:tcPr>
+            <w:tcW w:type="dxa" w:w="4320"/>
+          </w:tcPr>
+          <w:p>
+            <w:r>
+              <w:rPr>
+                <w:sz w:val="18"/>
+              </w:rPr>
+            </w:r>
+            <w:r>
+              <w:rPr>
+                <w:sz w:val="18"/>
+              </w:rPr>
+              <w:t>Places/reviews/saved probe</w:t>
+            </w:r>
+          </w:p>
+        </w:tc>
+        <w:tc>
+          <w:tcPr>
+            <w:tcW w:type="dxa" w:w="4320"/>
+          </w:tcPr>
+          <w:p>
+            <w:r>
+              <w:rPr>
+                <w:sz w:val="18"/>
+              </w:rPr>
+            </w:r>
+            <w:r>
+              <w:rPr>
+                <w:rFonts w:ascii="Consolas" w:hAnsi="Consolas"/>
+                <w:color w:val="9B2C5E"/>
+                <w:sz w:val="18"/>
+              </w:rPr>
+              <w:t>backend/store.py</w:t>
+            </w:r>
+          </w:p>
+        </w:tc>
+      </w:tr>
+      <w:tr>
+        <w:tc>
+          <w:tcPr>
+            <w:tcW w:type="dxa" w:w="4320"/>
+          </w:tcPr>
+          <w:p>
+            <w:r>
+              <w:rPr>
+                <w:sz w:val="18"/>
+              </w:rPr>
+            </w:r>
+            <w:r>
+              <w:rPr>
+                <w:sz w:val="18"/>
+              </w:rPr>
+              <w:t>Selectable layers (visual + slice filter)</w:t>
+            </w:r>
+          </w:p>
+        </w:tc>
+        <w:tc>
+          <w:tcPr>
+            <w:tcW w:type="dxa" w:w="4320"/>
+          </w:tcPr>
+          <w:p>
+            <w:r>
+              <w:rPr>
+                <w:sz w:val="18"/>
+              </w:rPr>
+            </w:r>
+            <w:r>
+              <w:rPr>
+                <w:rFonts w:ascii="Consolas" w:hAnsi="Consolas"/>
+                <w:color w:val="9B2C5E"/>
+                <w:sz w:val="18"/>
+              </w:rPr>
+              <w:t>web/style.json</w:t>
+            </w:r>
+            <w:r>
+              <w:rPr>
+                <w:sz w:val="18"/>
+              </w:rPr>
+              <w:t xml:space="preserve"> + </w:t>
+            </w:r>
+            <w:r>
+              <w:rPr>
+                <w:rFonts w:ascii="Consolas" w:hAnsi="Consolas"/>
+                <w:color w:val="9B2C5E"/>
+                <w:sz w:val="18"/>
+              </w:rPr>
+              <w:t>web/community.js</w:t>
+            </w:r>
+            <w:r>
+              <w:rPr>
+                <w:sz w:val="18"/>
+              </w:rPr>
+              <w:t xml:space="preserve"> toggles</w:t>
+            </w:r>
+          </w:p>
+        </w:tc>
+      </w:tr>
+      <w:tr>
+        <w:tc>
+          <w:tcPr>
+            <w:tcW w:type="dxa" w:w="4320"/>
+          </w:tcPr>
+          <w:p>
+            <w:r>
+              <w:rPr>
+                <w:sz w:val="18"/>
+              </w:rPr>
+            </w:r>
+            <w:r>
+              <w:rPr>
+                <w:sz w:val="18"/>
+              </w:rPr>
+              <w:t>NFL locked slot</w:t>
+            </w:r>
+          </w:p>
+        </w:tc>
+        <w:tc>
+          <w:tcPr>
+            <w:tcW w:type="dxa" w:w="4320"/>
+          </w:tcPr>
+          <w:p>
+            <w:r>
+              <w:rPr>
+                <w:sz w:val="18"/>
+              </w:rPr>
+            </w:r>
+            <w:r>
+              <w:rPr>
+                <w:rFonts w:ascii="Consolas" w:hAnsi="Consolas"/>
+                <w:color w:val="9B2C5E"/>
+                <w:sz w:val="18"/>
+              </w:rPr>
+              <w:t>context.py</w:t>
+            </w:r>
+            <w:r>
+              <w:rPr>
+                <w:sz w:val="18"/>
+              </w:rPr>
+              <w:t xml:space="preserve"> (</w:t>
+            </w:r>
+            <w:r>
+              <w:rPr>
+                <w:rFonts w:ascii="Consolas" w:hAnsi="Consolas"/>
+                <w:color w:val="9B2C5E"/>
+                <w:sz w:val="18"/>
+              </w:rPr>
+              <w:t>nfl_enabled</w:t>
+            </w:r>
+            <w:r>
+              <w:rPr>
+                <w:sz w:val="18"/>
+              </w:rPr>
+              <w:t xml:space="preserve"> flag, off by default)</w:t>
+            </w:r>
+          </w:p>
+        </w:tc>
+      </w:tr>
+    </w:tbl>
+    <w:p/>
+    <w:p>
+      <w:pPr>
+        <w:spacing w:before="40" w:after="40"/>
+        <w:pBdr>
+          <w:bottom w:val="single" w:sz="6" w:space="1" w:color="C8D2DA"/>
+        </w:pBdr>
+      </w:pPr>
+    </w:p>
+    <w:p>
+      <w:pPr>
+        <w:pStyle w:val="Heading2"/>
+      </w:pPr>
+      <w:r/>
+      <w:r>
+        <w:t>7. Build order to "any layer, fully"</w:t>
+      </w:r>
+    </w:p>
+    <w:p>
+      <w:pPr>
+        <w:pStyle w:val="ListNumber"/>
+      </w:pPr>
+      <w:r>
+        <w:rPr>
+          <w:b/>
+        </w:rPr>
+        <w:t>Wire the probe into the chart</w:t>
+      </w:r>
+      <w:r>
+        <w:t xml:space="preserve"> — tap a point (+ scrub time) → </w:t>
+      </w:r>
+      <w:r>
+        <w:rPr>
+          <w:rFonts w:ascii="Consolas" w:hAnsi="Consolas"/>
+          <w:color w:val="9B2C5E"/>
+          <w:sz w:val="19"/>
+        </w:rPr>
+        <w:t>/narrate</w:t>
+      </w:r>
+      <w:r>
+        <w:t xml:space="preserve"> → a slice card.</w:t>
+      </w:r>
+    </w:p>
+    <w:p>
+      <w:pPr>
+        <w:pStyle w:val="ListNumber"/>
+      </w:pPr>
+      <w:r>
+        <w:rPr>
+          <w:b/>
+        </w:rPr>
+        <w:t>Promote more weather fields</w:t>
+      </w:r>
+      <w:r>
+        <w:t xml:space="preserve"> into </w:t>
+      </w:r>
+      <w:r>
+        <w:rPr>
+          <w:rFonts w:ascii="Consolas" w:hAnsi="Consolas"/>
+          <w:color w:val="9B2C5E"/>
+          <w:sz w:val="19"/>
+        </w:rPr>
+        <w:t>get_weather</w:t>
+      </w:r>
+      <w:r>
+        <w:t xml:space="preserve"> (swell/rain/pressure/current/SST/CAPE).</w:t>
+      </w:r>
+    </w:p>
+    <w:p>
+      <w:pPr>
+        <w:pStyle w:val="ListNumber"/>
+      </w:pPr>
+      <w:r>
+        <w:rPr>
+          <w:b/>
+        </w:rPr>
+        <w:t>Depth-at-point</w:t>
+      </w:r>
+      <w:r>
+        <w:t xml:space="preserve"> from the engine + </w:t>
+      </w:r>
+      <w:r>
+        <w:rPr>
+          <w:b/>
+        </w:rPr>
+        <w:t>tides/currents</w:t>
+      </w:r>
+      <w:r>
+        <w:t xml:space="preserve"> harmonics into the slice.</w:t>
+      </w:r>
+    </w:p>
+    <w:p>
+      <w:pPr>
+        <w:pStyle w:val="ListNumber"/>
+      </w:pPr>
+      <w:r>
+        <w:rPr>
+          <w:b/>
+        </w:rPr>
+        <w:t>AIS + route-weather</w:t>
+      </w:r>
+      <w:r>
+        <w:t xml:space="preserve"> layers join the slice (engine already computes CPA/TCPA).</w:t>
+      </w:r>
+    </w:p>
+    <w:p>
+      <w:pPr>
+        <w:pStyle w:val="ListNumber"/>
+      </w:pPr>
+      <w:r>
+        <w:rPr>
+          <w:b/>
+        </w:rPr>
+        <w:t>Real climatology/tropical tier</w:t>
+      </w:r>
+      <w:r>
+        <w:t xml:space="preserve"> replaces the climate stub.</w:t>
+      </w:r>
+    </w:p>
+    <w:p>
+      <w:pPr>
+        <w:pStyle w:val="ListNumber"/>
+      </w:pPr>
+      <w:r>
+        <w:rPr>
+          <w:b/>
+        </w:rPr>
+        <w:t>Plugin layer contract</w:t>
+      </w:r>
+      <w:r>
+        <w:t xml:space="preserve"> — third-party layers implement </w:t>
+      </w:r>
+      <w:r>
+        <w:rPr>
+          <w:rFonts w:ascii="Consolas" w:hAnsi="Consolas"/>
+          <w:color w:val="9B2C5E"/>
+          <w:sz w:val="19"/>
+        </w:rPr>
+        <w:t>sample()</w:t>
+      </w:r>
+      <w:r>
+        <w:t xml:space="preserve"> and become narratable.</w:t>
+      </w:r>
+    </w:p>
+    <w:p>
+      <w:pPr>
+        <w:pStyle w:val="ListNumber"/>
+      </w:pPr>
+      <w:r>
+        <w:rPr>
+          <w:b/>
+        </w:rPr>
+        <w:t>NFL</w:t>
+      </w:r>
+      <w:r>
+        <w:t xml:space="preserve"> unlocks the slot via experimental flag (personal) or partnership.</w:t>
+      </w:r>
+    </w:p>
+    <w:p>
+      <w:pPr>
+        <w:spacing w:before="40" w:after="40"/>
+        <w:pBdr>
+          <w:bottom w:val="single" w:sz="6" w:space="1" w:color="C8D2DA"/>
+        </w:pBdr>
+      </w:pPr>
+    </w:p>
+    <w:p>
+      <w:r>
+        <w:t>*One field over space and time; every layer a function of where and when; one probe that</w:t>
+      </w:r>
+    </w:p>
+    <w:p>
+      <w:r>
+        <w:t>slices them all; one narrator that speaks the slice — honestly, with sources. That is the</w:t>
+      </w:r>
+    </w:p>
+    <w:p>
+      <w:r>
+        <w:t>spine the whole product hangs on.*</w:t>
+      </w:r>
+    </w:p>
+    <w:p>
+      <w:r>
+        <w:br w:type="page"/>
+      </w:r>
+    </w:p>
+    <w:p>
+      <w:pPr>
+        <w:pStyle w:val="Heading1"/>
+      </w:pPr>
+      <w:r/>
+      <w:r>
+        <w:t>Helm — Weather, Routing &amp; the Spacetime Engine</w:t>
+      </w:r>
+    </w:p>
+    <w:p>
+      <w:r>
+        <w:t>**Sample the weather along your *future track*, not at a fixed clock time. Make every</w:t>
+      </w:r>
+    </w:p>
+    <w:p>
+      <w:r>
+        <w:t>forecast update magic-in-the-background. Make ocean routing easy enough that you stop</w:t>
+      </w:r>
+    </w:p>
+    <w:p>
+      <w:r>
+        <w:t>juggling eight apps — and honest enough to tell you when to still call a human.**</w:t>
+      </w:r>
+    </w:p>
+    <w:p>
+      <w:pPr>
+        <w:ind w:left="432"/>
+        <w:pBdr>
+          <w:left w:val="single" w:sz="18" w:space="8" w:color="5BC0FF"/>
+        </w:pBdr>
+      </w:pPr>
+      <w:r>
+        <w:rPr>
+          <w:i/>
+          <w:color w:val="5A6B78"/>
+        </w:rPr>
+        <w:t xml:space="preserve">Status: Spec draft v0.1 · 2026-06-24 · Owner: Steve Ridder Companion to </w:t>
+      </w:r>
+      <w:r>
+        <w:rPr>
+          <w:i/>
+          <w:color w:val="5A6B78"/>
+          <w:u w:val="single"/>
+        </w:rPr>
+        <w:t>VISION.md</w:t>
+      </w:r>
+      <w:r>
+        <w:rPr>
+          <w:i/>
+          <w:color w:val="5A6B78"/>
+        </w:rPr>
+        <w:t xml:space="preserve"> (§6 Weather, §8 Copilot) and </w:t>
+      </w:r>
+      <w:r>
+        <w:rPr>
+          <w:i/>
+          <w:color w:val="5A6B78"/>
+          <w:u w:val="single"/>
+        </w:rPr>
+        <w:t>WEATHER.md</w:t>
+      </w:r>
+      <w:r>
+        <w:rPr>
+          <w:i/>
+          <w:color w:val="5A6B78"/>
+        </w:rPr>
+        <w:t xml:space="preserve"> (the own-GRIB rendering stack). Born from a real 18-day Maupiti→Fiji passage and the misery of constantly re-downloading GRIB, opening tabs, and re-deriving the route by hand.  </w:t>
+      </w:r>
+      <w:r>
+        <w:rPr>
+          <w:b/>
+          <w:i/>
+          <w:color w:val="5A6B78"/>
+        </w:rPr>
+        <w:t>Honesty note up front:</w:t>
+      </w:r>
+      <w:r>
+        <w:rPr>
+          <w:i/>
+          <w:color w:val="5A6B78"/>
+        </w:rPr>
+        <w:t xml:space="preserve"> a large share of the "magic" in this document is </w:t>
+      </w:r>
+      <w:r>
+        <w:rPr>
+          <w:b/>
+          <w:i/>
+          <w:color w:val="5A6B78"/>
+        </w:rPr>
+        <w:t>LLM-derived</w:t>
+      </w:r>
+      <w:r>
+        <w:rPr>
+          <w:i/>
+          <w:color w:val="5A6B78"/>
+        </w:rPr>
+        <w:t xml:space="preserve"> — briefings, the diff narration, departure advice, routing interpretation. Those parts are tagged </w:t>
+      </w:r>
+      <w:r>
+        <w:rPr>
+          <w:b/>
+          <w:i/>
+          <w:color w:val="5A6B78"/>
+        </w:rPr>
+        <w:t>[LLM]</w:t>
+      </w:r>
+      <w:r>
+        <w:rPr>
+          <w:i/>
+          <w:color w:val="5A6B78"/>
+        </w:rPr>
+        <w:t xml:space="preserve"> and governed by the guardrails in §7. The numbers underneath them (position, ETA, isochrones, CPA, wind/sea values) are </w:t>
+      </w:r>
+      <w:r>
+        <w:rPr>
+          <w:b/>
+          <w:i/>
+          <w:color w:val="5A6B78"/>
+        </w:rPr>
+        <w:t>deterministic</w:t>
+      </w:r>
+      <w:r>
+        <w:rPr>
+          <w:i/>
+          <w:color w:val="5A6B78"/>
+        </w:rPr>
+        <w:t xml:space="preserve"> and computed, never generated. The LLM *explains and sequences*; it never *invents* a forecast or a fix.</w:t>
+      </w:r>
+    </w:p>
+    <w:p>
+      <w:pPr>
+        <w:spacing w:before="40" w:after="40"/>
+        <w:pBdr>
+          <w:bottom w:val="single" w:sz="6" w:space="1" w:color="C8D2DA"/>
+        </w:pBdr>
+      </w:pPr>
+    </w:p>
+    <w:p>
+      <w:pPr>
+        <w:pStyle w:val="Heading2"/>
+      </w:pPr>
+      <w:r/>
+      <w:r>
+        <w:t>1. The core idea — spacetime coupling</w:t>
+      </w:r>
+    </w:p>
+    <w:p>
+      <w:r>
+        <w:t xml:space="preserve">Every weather app shows the field at a </w:t>
+      </w:r>
+      <w:r>
+        <w:rPr>
+          <w:b/>
+        </w:rPr>
+        <w:t>fixed wall-clock time</w:t>
+      </w:r>
+      <w:r>
+        <w:t xml:space="preserve"> and makes the human do the</w:t>
+      </w:r>
+    </w:p>
+    <w:p>
+      <w:r>
+        <w:t>projection: "the front arrives Thursday 14:00 — where will *I* be Thursday 14:00?" That</w:t>
+      </w:r>
+    </w:p>
+    <w:p>
+      <w:r>
+        <w:t>mental projection, repeated across wind/gust/swell/rain and re-done after every GRIB</w:t>
+      </w:r>
+    </w:p>
+    <w:p>
+      <w:r>
+        <w:t>download, *is* the work that exhausts passage-makers.</w:t>
+      </w:r>
+    </w:p>
+    <w:p>
+      <w:r>
+        <w:t xml:space="preserve">Reframe it. Your boat is a </w:t>
+      </w:r>
+      <w:r>
+        <w:rPr>
+          <w:b/>
+        </w:rPr>
+        <w:t>worldline</w:t>
+      </w:r>
+      <w:r>
+        <w:t xml:space="preserve"> — position as a function of time, </w:t>
+      </w:r>
+      <w:r>
+        <w:rPr>
+          <w:rFonts w:ascii="Consolas" w:hAnsi="Consolas"/>
+          <w:color w:val="9B2C5E"/>
+          <w:sz w:val="19"/>
+        </w:rPr>
+        <w:t>P(t)</w:t>
+      </w:r>
+      <w:r>
+        <w:t>. Weather</w:t>
+      </w:r>
+    </w:p>
+    <w:p>
+      <w:r>
+        <w:t xml:space="preserve">is a </w:t>
+      </w:r>
+      <w:r>
+        <w:rPr>
+          <w:b/>
+        </w:rPr>
+        <w:t>4-D field</w:t>
+      </w:r>
+      <w:r>
+        <w:t xml:space="preserve"> — </w:t>
+      </w:r>
+      <w:r>
+        <w:rPr>
+          <w:rFonts w:ascii="Consolas" w:hAnsi="Consolas"/>
+          <w:color w:val="9B2C5E"/>
+          <w:sz w:val="19"/>
+        </w:rPr>
         <w:t>W(lat, lon, t)</w:t>
       </w:r>
       <w:r>
@@ -6003,6 +8365,74 @@
     <w:p>
       <w:r>
         <w:t>joins them. That join is the whole feature.</w:t>
+      </w:r>
+    </w:p>
+    <w:p>
+      <w:pPr>
+        <w:ind w:left="432"/>
+        <w:pBdr>
+          <w:left w:val="single" w:sz="18" w:space="8" w:color="5BC0FF"/>
+        </w:pBdr>
+      </w:pPr>
+      <w:r>
+        <w:rPr>
+          <w:b/>
+          <w:i/>
+          <w:color w:val="5A6B78"/>
+        </w:rPr>
+        <w:t>Generalized:</w:t>
+      </w:r>
+      <w:r>
+        <w:rPr>
+          <w:i/>
+          <w:color w:val="5A6B78"/>
+        </w:rPr>
+        <w:t xml:space="preserve"> weather is just one layer of this. *Every* layer (depth, places, reviews, climate, NFL, …) is a function of where and when, and Helm fuses them all at a point into one narratable </w:t>
+      </w:r>
+      <w:r>
+        <w:rPr>
+          <w:b/>
+          <w:i/>
+          <w:color w:val="5A6B78"/>
+        </w:rPr>
+        <w:t>slice</w:t>
+      </w:r>
+      <w:r>
+        <w:rPr>
+          <w:i/>
+          <w:color w:val="5A6B78"/>
+        </w:rPr>
+        <w:t xml:space="preserve"> — see </w:t>
+      </w:r>
+      <w:r>
+        <w:rPr>
+          <w:i/>
+          <w:color w:val="5A6B78"/>
+          <w:u w:val="single"/>
+        </w:rPr>
+        <w:t>SPACETIME-PROBE.md</w:t>
+      </w:r>
+      <w:r>
+        <w:rPr>
+          <w:i/>
+          <w:color w:val="5A6B78"/>
+        </w:rPr>
+        <w:t xml:space="preserve"> / </w:t>
+      </w:r>
+      <w:r>
+        <w:rPr>
+          <w:i/>
+          <w:color w:val="5A6B78"/>
+          <w:u w:val="single"/>
+        </w:rPr>
+        <w:t>ADR-0007</w:t>
+      </w:r>
+      <w:r>
+        <w:rPr>
+          <w:i/>
+          <w:color w:val="5A6B78"/>
+        </w:rPr>
+        <w:t>. This section is the weather instance of that primitive.</w:t>
       </w:r>
     </w:p>
     <w:p>
@@ -8620,6 +11050,82 @@
     </w:p>
     <w:p>
       <w:pPr>
+        <w:ind w:left="432"/>
+        <w:pBdr>
+          <w:left w:val="single" w:sz="18" w:space="8" w:color="5BC0FF"/>
+        </w:pBdr>
+      </w:pPr>
+      <w:r>
+        <w:rPr>
+          <w:i/>
+          <w:color w:val="5A6B78"/>
+        </w:rPr>
+        <w:t xml:space="preserve">Both briefings are the </w:t>
+      </w:r>
+      <w:r>
+        <w:rPr>
+          <w:b/>
+          <w:i/>
+          <w:color w:val="5A6B78"/>
+        </w:rPr>
+        <w:t>spacetime probe</w:t>
+      </w:r>
+      <w:r>
+        <w:rPr>
+          <w:i/>
+          <w:color w:val="5A6B78"/>
+        </w:rPr>
+        <w:t xml:space="preserve"> (</w:t>
+      </w:r>
+      <w:r>
+        <w:rPr>
+          <w:i/>
+          <w:color w:val="5A6B78"/>
+          <w:u w:val="single"/>
+        </w:rPr>
+        <w:t>SPACETIME-PROBE.md</w:t>
+      </w:r>
+      <w:r>
+        <w:rPr>
+          <w:i/>
+          <w:color w:val="5A6B78"/>
+        </w:rPr>
+        <w:t xml:space="preserve"> · </w:t>
+      </w:r>
+      <w:r>
+        <w:rPr>
+          <w:i/>
+          <w:color w:val="5A6B78"/>
+          <w:u w:val="single"/>
+        </w:rPr>
+        <w:t>ADR-0007</w:t>
+      </w:r>
+      <w:r>
+        <w:rPr>
+          <w:i/>
+          <w:color w:val="5A6B78"/>
+        </w:rPr>
+        <w:t xml:space="preserve">) at different geometries: "along the way" is the probe along your path </w:t>
+      </w:r>
+      <w:r>
+        <w:rPr>
+          <w:rFonts w:ascii="Consolas" w:hAnsi="Consolas"/>
+          <w:i/>
+          <w:color w:val="5A6B78"/>
+          <w:sz w:val="19"/>
+        </w:rPr>
+        <w:t>P(t)</w:t>
+      </w:r>
+      <w:r>
+        <w:rPr>
+          <w:i/>
+          <w:color w:val="5A6B78"/>
+        </w:rPr>
+        <w:t>; "once I get there" is the probe at a destination + ETA. Any layer in the slice is fair game for either briefing.</w:t>
+      </w:r>
+    </w:p>
+    <w:p>
+      <w:pPr>
         <w:spacing w:before="40" w:after="40"/>
         <w:pBdr>
           <w:bottom w:val="single" w:sz="6" w:space="1" w:color="C8D2DA"/>
@@ -9399,6 +11905,346 @@
           <w:u w:val="single"/>
         </w:rPr>
         <w:t>ADR-0006</w:t>
+      </w:r>
+      <w:r>
+        <w:t>.</w:t>
+      </w:r>
+    </w:p>
+    <w:p>
+      <w:pPr>
+        <w:pStyle w:val="Heading2"/>
+      </w:pPr>
+      <w:r/>
+      <w:r>
+        <w:t>3c. Pin it — research becomes pins on the plotter (saved places)</w:t>
+      </w:r>
+    </w:p>
+    <w:p>
+      <w:r>
+        <w:t xml:space="preserve">The deep-read loop has an </w:t>
+      </w:r>
+      <w:r>
+        <w:rPr>
+          <w:b/>
+        </w:rPr>
+        <w:t>output</w:t>
+      </w:r>
+      <w:r>
+        <w:t>: saved places. While researching on the phone, tap</w:t>
+      </w:r>
+    </w:p>
+    <w:p>
+      <w:r>
+        <w:rPr>
+          <w:b/>
+        </w:rPr>
+        <w:t>Pin to chart</w:t>
+      </w:r>
+      <w:r>
+        <w:t xml:space="preserve"> on any spot — an anchorage, a snorkeling reef a blog raved about, a</w:t>
+      </w:r>
+    </w:p>
+    <w:p>
+      <w:r>
+        <w:t xml:space="preserve">chandlery, a "check the bar at half-tide" hazard. It </w:t>
+      </w:r>
+      <w:r>
+        <w:rPr>
+          <w:b/>
+        </w:rPr>
+        <w:t>syncs to the helm</w:t>
+      </w:r>
+      <w:r>
+        <w:t xml:space="preserve"> and shows up as a</w:t>
+      </w:r>
+    </w:p>
+    <w:p>
+      <w:r>
+        <w:t xml:space="preserve">POI/bookmark on the plotter, carrying the </w:t>
+      </w:r>
+      <w:r>
+        <w:rPr>
+          <w:b/>
+        </w:rPr>
+        <w:t>note</w:t>
+      </w:r>
+      <w:r>
+        <w:t xml:space="preserve"> and the </w:t>
+      </w:r>
+      <w:r>
+        <w:rPr>
+          <w:b/>
+        </w:rPr>
+        <w:t>source link</w:t>
+      </w:r>
+      <w:r>
+        <w:t xml:space="preserve"> you saved it from.</w:t>
+      </w:r>
+    </w:p>
+    <w:p>
+      <w:r>
+        <w:t>Bookmarks you can sail up to. This is the feature Steve named: *"as I read and research, pin</w:t>
+      </w:r>
+    </w:p>
+    <w:p>
+      <w:r>
+        <w:t>locations from my phone that stick on the Helm plotter — bookmarks that become POIs/waypoints</w:t>
+      </w:r>
+    </w:p>
+    <w:p>
+      <w:r>
+        <w:t>to check out."*</w:t>
+      </w:r>
+    </w:p>
+    <w:p>
+      <w:r>
+        <w:rPr>
+          <w:b/>
+        </w:rPr>
+        <w:t>Data model — a Saved Place:</w:t>
+      </w:r>
+    </w:p>
+    <w:p>
+      <w:pPr>
+        <w:pStyle w:val="ListBullet"/>
+      </w:pPr>
+      <w:r>
+        <w:t xml:space="preserve">location (a point, or attached to a known POI), title, </w:t>
+      </w:r>
+      <w:r>
+        <w:rPr>
+          <w:b/>
+        </w:rPr>
+        <w:t>category + icon</w:t>
+      </w:r>
+      <w:r>
+        <w:t xml:space="preserve"> (anchorage ·</w:t>
+      </w:r>
+    </w:p>
+    <w:p>
+      <w:r>
+        <w:t>snorkel · provisioning · fuel · repair · hazard · must-see · sundowner …),</w:t>
+      </w:r>
+    </w:p>
+    <w:p>
+      <w:pPr>
+        <w:pStyle w:val="ListBullet"/>
+      </w:pPr>
+      <w:r>
+        <w:t xml:space="preserve">a </w:t>
+      </w:r>
+      <w:r>
+        <w:rPr>
+          <w:b/>
+        </w:rPr>
+        <w:t>note</w:t>
+      </w:r>
+      <w:r>
+        <w:t xml:space="preserve"> (your words, or the quote you pinned), </w:t>
+      </w:r>
+      <w:r>
+        <w:rPr>
+          <w:b/>
+        </w:rPr>
+        <w:t>source link(s)</w:t>
+      </w:r>
+      <w:r>
+        <w:t xml:space="preserve"> auto-attached from the</w:t>
+      </w:r>
+    </w:p>
+    <w:p>
+      <w:r>
+        <w:t>deep-read (the Noonsite/blog page), optional photos,</w:t>
+      </w:r>
+    </w:p>
+    <w:p>
+      <w:pPr>
+        <w:pStyle w:val="ListBullet"/>
+      </w:pPr>
+      <w:r>
+        <w:rPr>
+          <w:b/>
+        </w:rPr>
+        <w:t>status</w:t>
+      </w:r>
+      <w:r>
+        <w:t xml:space="preserve"> (to-check · visited · skip), created-on device + time, color.</w:t>
+      </w:r>
+    </w:p>
+    <w:p>
+      <w:r>
+        <w:rPr>
+          <w:b/>
+        </w:rPr>
+        <w:t>Behavior:</w:t>
+      </w:r>
+    </w:p>
+    <w:p>
+      <w:pPr>
+        <w:pStyle w:val="ListBullet"/>
+      </w:pPr>
+      <w:r>
+        <w:rPr>
+          <w:b/>
+        </w:rPr>
+        <w:t>Owned · synced · offline-first.</w:t>
+      </w:r>
+      <w:r>
+        <w:t xml:space="preserve"> Lives in Helm's backend (the *owned* tier of</w:t>
+      </w:r>
+    </w:p>
+    <w:p>
+      <w:r>
+        <w:rPr>
+          <w:color w:val="1F6FA8"/>
+          <w:u w:val="single"/>
+        </w:rPr>
+        <w:t>ADR-0005</w:t>
+      </w:r>
+      <w:r>
+        <w:t xml:space="preserve">); syncs </w:t>
+      </w:r>
+      <w:r>
+        <w:rPr>
+          <w:b/>
+        </w:rPr>
+        <w:t>phone ↔ iPad ↔ helm</w:t>
+      </w:r>
+      <w:r>
+        <w:t>;</w:t>
+      </w:r>
+    </w:p>
+    <w:p>
+      <w:r>
+        <w:t>created offline, queued, flushed on reconnect — same discipline as the NFL push. **Private</w:t>
+      </w:r>
+    </w:p>
+    <w:p>
+      <w:r>
+        <w:t>by default**, optionally shared with buddy boats / fleet.</w:t>
+      </w:r>
+    </w:p>
+    <w:p>
+      <w:pPr>
+        <w:pStyle w:val="ListBullet"/>
+      </w:pPr>
+      <w:r>
+        <w:rPr>
+          <w:b/>
+        </w:rPr>
+        <w:t>Distinct from waypoints — until you want them to be.</w:t>
+      </w:r>
+      <w:r>
+        <w:t xml:space="preserve"> Saved places are *aspirational*</w:t>
+      </w:r>
+    </w:p>
+    <w:p>
+      <w:r>
+        <w:t xml:space="preserve">("go check this out"), rendered as a toggleable </w:t>
+      </w:r>
+      <w:r>
+        <w:rPr>
+          <w:b/>
+        </w:rPr>
+        <w:t>Saved / Bookmarks</w:t>
+      </w:r>
+      <w:r>
+        <w:t xml:space="preserve"> POI layer, visually</w:t>
+      </w:r>
+    </w:p>
+    <w:p>
+      <w:r>
+        <w:t xml:space="preserve">distinct from active route waypoints. One tap </w:t>
+      </w:r>
+      <w:r>
+        <w:rPr>
+          <w:b/>
+        </w:rPr>
+        <w:t>promotes</w:t>
+      </w:r>
+      <w:r>
+        <w:t xml:space="preserve"> a pin to a waypoint ("Add to</w:t>
+      </w:r>
+    </w:p>
+    <w:p>
+      <w:r>
+        <w:t xml:space="preserve">route" / "Navigate here"). The pipeline: </w:t>
+      </w:r>
+      <w:r>
+        <w:rPr>
+          <w:b/>
+        </w:rPr>
+        <w:t>research → bookmark → POI → waypoint.</w:t>
+      </w:r>
+    </w:p>
+    <w:p>
+      <w:pPr>
+        <w:pStyle w:val="ListBullet"/>
+      </w:pPr>
+      <w:r>
+        <w:rPr>
+          <w:b/>
+        </w:rPr>
+        <w:t>Collections.</w:t>
+      </w:r>
+      <w:r>
+        <w:t xml:space="preserve"> Group pins into lists ("Fiji must-dos", "Provisioning run", "Before we</w:t>
+      </w:r>
+    </w:p>
+    <w:p>
+      <w:r>
+        <w:t>leave") — Google-Maps-"Saved"-style; lists are shareable.</w:t>
+      </w:r>
+    </w:p>
+    <w:p>
+      <w:r>
+        <w:t xml:space="preserve">This closes the loop the whole product implies: you </w:t>
+      </w:r>
+      <w:r>
+        <w:rPr>
+          <w:b/>
+        </w:rPr>
+        <w:t>read</w:t>
+      </w:r>
+      <w:r>
+        <w:t xml:space="preserve"> on the phone, </w:t>
+      </w:r>
+      <w:r>
+        <w:rPr>
+          <w:b/>
+        </w:rPr>
+        <w:t>pin</w:t>
+      </w:r>
+      <w:r>
+        <w:t xml:space="preserve"> what</w:t>
+      </w:r>
+    </w:p>
+    <w:p>
+      <w:r>
+        <w:t xml:space="preserve">matters, and it's </w:t>
+      </w:r>
+      <w:r>
+        <w:rPr>
+          <w:b/>
+        </w:rPr>
+        <w:t>waiting on the chart</w:t>
+      </w:r>
+      <w:r>
+        <w:t xml:space="preserve"> when you arrive — and every pin is owned community</w:t>
+      </w:r>
+    </w:p>
+    <w:p>
+      <w:r>
+        <w:t>data that, with permission, enriches the next sailor's dossier. Wireframe:</w:t>
+      </w:r>
+    </w:p>
+    <w:p>
+      <w:r>
+        <w:rPr>
+          <w:color w:val="1F6FA8"/>
+          <w:u w:val="single"/>
+        </w:rPr>
+        <w:t>mockups/saved-places-sync.html</w:t>
       </w:r>
       <w:r>
         <w:t>.</w:t>

</xml_diff>